<commit_message>
Add new prompts for various species-specific visual feature extraction
- Introduced prompts for Beluga, Bird, Chimpanzee, Humpback Whale, Giant Panda, Leopard, Lion, Dolphin, Nyala, Seal, and Whale Shark.
- Each prompt includes a structured JSON schema for annotating visual features based on camera-trap images.
- Implemented strict output constraints to ensure data integrity and prevent hallucination in feature extraction.
</commit_message>
<xml_diff>
--- a/scripts/p2/ontology/Giraffes.docx
+++ b/scripts/p2/ontology/Giraffes.docx
@@ -6,23 +6,6 @@
       <w:pPr>
         <w:rPr>
           <w:rFonts w:ascii="Times New Roman" w:hAnsi="Times New Roman" w:cs="Times New Roman"/>
-          <w:b/>
-          <w:bCs/>
-        </w:rPr>
-      </w:pPr>
-      <w:r>
-        <w:rPr>
-          <w:rFonts w:ascii="Times New Roman" w:hAnsi="Times New Roman" w:cs="Times New Roman"/>
-          <w:b/>
-          <w:bCs/>
-        </w:rPr>
-        <w:t># Construct Ontology - Theory</w:t>
-      </w:r>
-    </w:p>
-    <w:p>
-      <w:pPr>
-        <w:rPr>
-          <w:rFonts w:ascii="Times New Roman" w:hAnsi="Times New Roman" w:cs="Times New Roman"/>
         </w:rPr>
       </w:pPr>
       <w:r>
@@ -371,1609 +354,6 @@
     </w:p>
     <w:p>
       <w:pPr>
-        <w:pBdr>
-          <w:bottom w:val="single" w:sz="6" w:space="1" w:color="auto"/>
-        </w:pBdr>
-        <w:rPr>
-          <w:rFonts w:ascii="Times New Roman" w:hAnsi="Times New Roman" w:cs="Times New Roman"/>
-        </w:rPr>
-      </w:pPr>
-    </w:p>
-    <w:p>
-      <w:pPr>
-        <w:rPr>
-          <w:rFonts w:ascii="Times New Roman" w:hAnsi="Times New Roman" w:cs="Times New Roman"/>
-        </w:rPr>
-      </w:pPr>
-    </w:p>
-    <w:p>
-      <w:pPr>
-        <w:rPr>
-          <w:rFonts w:ascii="Times New Roman" w:hAnsi="Times New Roman" w:cs="Times New Roman"/>
-          <w:b/>
-          <w:bCs/>
-        </w:rPr>
-      </w:pPr>
-      <w:r>
-        <w:rPr>
-          <w:rFonts w:ascii="Times New Roman" w:hAnsi="Times New Roman" w:cs="Times New Roman"/>
-          <w:b/>
-          <w:bCs/>
-        </w:rPr>
-        <w:t># Construct Ontology</w:t>
-      </w:r>
-      <w:r>
-        <w:rPr>
-          <w:rFonts w:ascii="Times New Roman" w:hAnsi="Times New Roman" w:cs="Times New Roman"/>
-          <w:b/>
-          <w:bCs/>
-        </w:rPr>
-        <w:t xml:space="preserve"> - </w:t>
-      </w:r>
-      <w:r>
-        <w:rPr>
-          <w:rFonts w:ascii="Times New Roman" w:hAnsi="Times New Roman" w:cs="Times New Roman"/>
-          <w:b/>
-          <w:bCs/>
-        </w:rPr>
-        <w:t>Viable</w:t>
-      </w:r>
-    </w:p>
-    <w:p>
-      <w:pPr>
-        <w:rPr>
-          <w:rFonts w:ascii="Times New Roman" w:hAnsi="Times New Roman" w:cs="Times New Roman"/>
-        </w:rPr>
-      </w:pPr>
-      <w:r>
-        <w:rPr>
-          <w:rFonts w:ascii="Times New Roman" w:hAnsi="Times New Roman" w:cs="Times New Roman"/>
-          <w:b/>
-          <w:bCs/>
-        </w:rPr>
-        <w:t>Role &amp; Context:</w:t>
-      </w:r>
-    </w:p>
-    <w:p>
-      <w:pPr>
-        <w:rPr>
-          <w:rFonts w:ascii="Times New Roman" w:hAnsi="Times New Roman" w:cs="Times New Roman"/>
-        </w:rPr>
-      </w:pPr>
-      <w:r>
-        <w:rPr>
-          <w:rFonts w:ascii="Times New Roman" w:hAnsi="Times New Roman" w:cs="Times New Roman"/>
-        </w:rPr>
-        <w:t>You are a rigorous Computer Vision Data Engineer responsible for translating biological theories into actionable and robust image annotation standards for an Animal Re-Identification (</w:t>
-      </w:r>
-      <w:proofErr w:type="spellStart"/>
-      <w:r>
-        <w:rPr>
-          <w:rFonts w:ascii="Times New Roman" w:hAnsi="Times New Roman" w:cs="Times New Roman"/>
-        </w:rPr>
-        <w:t>ReID</w:t>
-      </w:r>
-      <w:proofErr w:type="spellEnd"/>
-      <w:r>
-        <w:rPr>
-          <w:rFonts w:ascii="Times New Roman" w:hAnsi="Times New Roman" w:cs="Times New Roman"/>
-        </w:rPr>
-        <w:t>) benchmark.</w:t>
-      </w:r>
-    </w:p>
-    <w:p>
-      <w:pPr>
-        <w:rPr>
-          <w:rFonts w:ascii="Times New Roman" w:hAnsi="Times New Roman" w:cs="Times New Roman"/>
-        </w:rPr>
-      </w:pPr>
-      <w:r>
-        <w:rPr>
-          <w:rFonts w:ascii="Times New Roman" w:hAnsi="Times New Roman" w:cs="Times New Roman"/>
-          <w:b/>
-          <w:bCs/>
-        </w:rPr>
-        <w:t>Background &amp; Input:</w:t>
-      </w:r>
-    </w:p>
-    <w:p>
-      <w:pPr>
-        <w:rPr>
-          <w:rFonts w:ascii="Times New Roman" w:hAnsi="Times New Roman" w:cs="Times New Roman"/>
-        </w:rPr>
-      </w:pPr>
-      <w:r>
-        <w:rPr>
-          <w:rFonts w:ascii="Times New Roman" w:hAnsi="Times New Roman" w:cs="Times New Roman"/>
-        </w:rPr>
-        <w:t>The text provided above is our theoretical "Giraffa Visual Feature Ontology".</w:t>
-      </w:r>
-    </w:p>
-    <w:p>
-      <w:pPr>
-        <w:rPr>
-          <w:rFonts w:ascii="Times New Roman" w:hAnsi="Times New Roman" w:cs="Times New Roman"/>
-        </w:rPr>
-      </w:pPr>
-      <w:r>
-        <w:rPr>
-          <w:rFonts w:ascii="Times New Roman" w:hAnsi="Times New Roman" w:cs="Times New Roman"/>
-        </w:rPr>
-        <w:lastRenderedPageBreak/>
-        <w:t>The attached images are samples from our real-world research dataset. Please note that these images may suffer from physical constraints typical of field data, such as limited viewpoints (mostly lateral/dorsal), constrained resolution, occlusions, and varying lighting conditions.</w:t>
-      </w:r>
-    </w:p>
-    <w:p>
-      <w:pPr>
-        <w:rPr>
-          <w:rFonts w:ascii="Times New Roman" w:hAnsi="Times New Roman" w:cs="Times New Roman"/>
-        </w:rPr>
-      </w:pPr>
-      <w:r>
-        <w:rPr>
-          <w:rFonts w:ascii="Times New Roman" w:hAnsi="Times New Roman" w:cs="Times New Roman"/>
-          <w:b/>
-          <w:bCs/>
-        </w:rPr>
-        <w:t>Your Task:</w:t>
-      </w:r>
-    </w:p>
-    <w:p>
-      <w:pPr>
-        <w:rPr>
-          <w:rFonts w:ascii="Times New Roman" w:hAnsi="Times New Roman" w:cs="Times New Roman"/>
-        </w:rPr>
-      </w:pPr>
-      <w:r>
-        <w:rPr>
-          <w:rFonts w:ascii="Times New Roman" w:hAnsi="Times New Roman" w:cs="Times New Roman"/>
-        </w:rPr>
-        <w:t>Please carefully observe these real-world sample images and cross-reference them against the 5 major feature categories in the theoretical ontology. Execute the following steps:</w:t>
-      </w:r>
-    </w:p>
-    <w:p>
-      <w:pPr>
-        <w:numPr>
-          <w:ilvl w:val="0"/>
-          <w:numId w:val="1"/>
-        </w:numPr>
-        <w:rPr>
-          <w:rFonts w:ascii="Times New Roman" w:hAnsi="Times New Roman" w:cs="Times New Roman"/>
-        </w:rPr>
-      </w:pPr>
-      <w:r>
-        <w:rPr>
-          <w:rFonts w:ascii="Times New Roman" w:hAnsi="Times New Roman" w:cs="Times New Roman"/>
-          <w:b/>
-          <w:bCs/>
-        </w:rPr>
-        <w:t>Feasibility Filtering (Pruning):</w:t>
-      </w:r>
-      <w:r>
-        <w:rPr>
-          <w:rFonts w:ascii="Times New Roman" w:hAnsi="Times New Roman" w:cs="Times New Roman"/>
-        </w:rPr>
-        <w:t xml:space="preserve"> Which features (or their specific morphological sub-dimensions) are generally blurry, consistently unobservable, or frequently missing due to camera angles/resolution in these sample images? Please ruthlessly eliminate them from the ontology. Provide a brief justification for each removal (e.g., "The jagged/smooth edge of the pelage network is invisible due to insufficient sensor resolution").</w:t>
-      </w:r>
-    </w:p>
-    <w:p>
-      <w:pPr>
-        <w:numPr>
-          <w:ilvl w:val="0"/>
-          <w:numId w:val="1"/>
-        </w:numPr>
-        <w:rPr>
-          <w:rFonts w:ascii="Times New Roman" w:hAnsi="Times New Roman" w:cs="Times New Roman"/>
-        </w:rPr>
-      </w:pPr>
-      <w:r>
-        <w:rPr>
-          <w:rFonts w:ascii="Times New Roman" w:hAnsi="Times New Roman" w:cs="Times New Roman"/>
-          <w:b/>
-          <w:bCs/>
-        </w:rPr>
-        <w:t>Retention &amp; Refinement:</w:t>
-      </w:r>
-      <w:r>
-        <w:rPr>
-          <w:rFonts w:ascii="Times New Roman" w:hAnsi="Times New Roman" w:cs="Times New Roman"/>
-        </w:rPr>
-        <w:t xml:space="preserve"> Which features remain exceptionally clear and highly discriminative across these specific images? Fine-tune the descriptions of these retained features to better align with the actual visual perspective of an AI model or a human annotator (e.g., adapting biological terms into pixel-level or structural visual cues).</w:t>
-      </w:r>
-    </w:p>
-    <w:p>
-      <w:pPr>
-        <w:numPr>
-          <w:ilvl w:val="0"/>
-          <w:numId w:val="1"/>
-        </w:numPr>
-        <w:rPr>
-          <w:rFonts w:ascii="Times New Roman" w:hAnsi="Times New Roman" w:cs="Times New Roman"/>
-        </w:rPr>
-      </w:pPr>
-      <w:r>
-        <w:rPr>
-          <w:rFonts w:ascii="Times New Roman" w:hAnsi="Times New Roman" w:cs="Times New Roman"/>
-          <w:b/>
-          <w:bCs/>
-        </w:rPr>
-        <w:t>Output the Viable Ontology ($D_{viable}$):</w:t>
-      </w:r>
-      <w:r>
-        <w:rPr>
-          <w:rFonts w:ascii="Times New Roman" w:hAnsi="Times New Roman" w:cs="Times New Roman"/>
-        </w:rPr>
-        <w:t xml:space="preserve"> Output the final, refined, and pruned feature list that is strictly grounded in the visual reality of the provided dataset.</w:t>
-      </w:r>
-    </w:p>
-    <w:p>
-      <w:pPr>
-        <w:pBdr>
-          <w:bottom w:val="single" w:sz="6" w:space="1" w:color="auto"/>
-        </w:pBdr>
-        <w:rPr>
-          <w:rFonts w:ascii="Times New Roman" w:hAnsi="Times New Roman" w:cs="Times New Roman"/>
-        </w:rPr>
-      </w:pPr>
-    </w:p>
-    <w:p>
-      <w:pPr>
-        <w:rPr>
-          <w:rFonts w:ascii="Times New Roman" w:hAnsi="Times New Roman" w:cs="Times New Roman"/>
-        </w:rPr>
-      </w:pPr>
-    </w:p>
-    <w:p>
-      <w:pPr>
-        <w:rPr>
-          <w:rFonts w:ascii="Times New Roman" w:hAnsi="Times New Roman" w:cs="Times New Roman"/>
-          <w:b/>
-          <w:bCs/>
-        </w:rPr>
-      </w:pPr>
-      <w:r>
-        <w:rPr>
-          <w:rFonts w:ascii="Times New Roman" w:hAnsi="Times New Roman" w:cs="Times New Roman" w:hint="eastAsia"/>
-        </w:rPr>
-        <w:t xml:space="preserve"># </w:t>
-      </w:r>
-      <w:r>
-        <w:rPr>
-          <w:rFonts w:ascii="Times New Roman" w:hAnsi="Times New Roman" w:cs="Times New Roman" w:hint="eastAsia"/>
-          <w:b/>
-          <w:bCs/>
-        </w:rPr>
-        <w:t>Output</w:t>
-      </w:r>
-    </w:p>
-    <w:p>
-      <w:pPr>
-        <w:rPr>
-          <w:rFonts w:ascii="Times New Roman" w:hAnsi="Times New Roman" w:cs="Times New Roman"/>
-        </w:rPr>
-      </w:pPr>
-      <w:r>
-        <w:rPr>
-          <w:rFonts w:ascii="Times New Roman" w:hAnsi="Times New Roman" w:cs="Times New Roman"/>
-        </w:rPr>
-        <w:t>An analysis of the provided sample dataset reveals a fundamental disconnect between the theoretical biological ontology and the empirical reality of the camera trap imagery. The primary constraint is the localized Field of View (</w:t>
-      </w:r>
-      <w:proofErr w:type="spellStart"/>
-      <w:r>
-        <w:rPr>
-          <w:rFonts w:ascii="Times New Roman" w:hAnsi="Times New Roman" w:cs="Times New Roman"/>
-        </w:rPr>
-        <w:t>FoV</w:t>
-      </w:r>
-      <w:proofErr w:type="spellEnd"/>
-      <w:r>
-        <w:rPr>
-          <w:rFonts w:ascii="Times New Roman" w:hAnsi="Times New Roman" w:cs="Times New Roman"/>
-        </w:rPr>
-        <w:t>): the images consistently capture tightly cropped lateral and dorsal views of the torso, rump, and lower neck, entirely omitting the cranial, caudal, and distal limb regions.</w:t>
-      </w:r>
-    </w:p>
-    <w:p>
-      <w:pPr>
-        <w:rPr>
-          <w:rFonts w:ascii="Times New Roman" w:hAnsi="Times New Roman" w:cs="Times New Roman"/>
-        </w:rPr>
-      </w:pPr>
-      <w:r>
-        <w:rPr>
-          <w:rFonts w:ascii="Times New Roman" w:hAnsi="Times New Roman" w:cs="Times New Roman"/>
-        </w:rPr>
-        <w:t>To engineer a robust Re-Identification (</w:t>
-      </w:r>
-      <w:proofErr w:type="spellStart"/>
-      <w:r>
-        <w:rPr>
-          <w:rFonts w:ascii="Times New Roman" w:hAnsi="Times New Roman" w:cs="Times New Roman"/>
-        </w:rPr>
-        <w:t>ReID</w:t>
-      </w:r>
-      <w:proofErr w:type="spellEnd"/>
-      <w:r>
-        <w:rPr>
-          <w:rFonts w:ascii="Times New Roman" w:hAnsi="Times New Roman" w:cs="Times New Roman"/>
-        </w:rPr>
-        <w:t>) system, we must abandon unobservable biological ideals and optimize for the visual data available.</w:t>
-      </w:r>
-    </w:p>
-    <w:p>
-      <w:pPr>
-        <w:rPr>
-          <w:rFonts w:ascii="Times New Roman" w:hAnsi="Times New Roman" w:cs="Times New Roman"/>
-          <w:b/>
-          <w:bCs/>
-        </w:rPr>
-      </w:pPr>
-      <w:r>
-        <w:rPr>
-          <w:rFonts w:ascii="Times New Roman" w:hAnsi="Times New Roman" w:cs="Times New Roman"/>
-          <w:b/>
-          <w:bCs/>
-        </w:rPr>
-        <w:t>Phase 1: Feasibility Filtering (Pruning)</w:t>
-      </w:r>
-    </w:p>
-    <w:p>
-      <w:pPr>
-        <w:rPr>
-          <w:rFonts w:ascii="Times New Roman" w:hAnsi="Times New Roman" w:cs="Times New Roman"/>
-        </w:rPr>
-      </w:pPr>
-      <w:r>
-        <w:rPr>
-          <w:rFonts w:ascii="Times New Roman" w:hAnsi="Times New Roman" w:cs="Times New Roman"/>
-        </w:rPr>
-        <w:t>The following theoretical features must be aggressively pruned from the active annotation schema, as they are unobservable in the current dataset:</w:t>
-      </w:r>
-    </w:p>
-    <w:p>
-      <w:pPr>
-        <w:numPr>
-          <w:ilvl w:val="0"/>
-          <w:numId w:val="10"/>
-        </w:numPr>
-        <w:rPr>
-          <w:rFonts w:ascii="Times New Roman" w:hAnsi="Times New Roman" w:cs="Times New Roman"/>
-        </w:rPr>
-      </w:pPr>
-      <w:proofErr w:type="spellStart"/>
-      <w:r>
-        <w:rPr>
-          <w:rFonts w:ascii="Times New Roman" w:hAnsi="Times New Roman" w:cs="Times New Roman"/>
-          <w:b/>
-          <w:bCs/>
-        </w:rPr>
-        <w:t>Ossicone</w:t>
-      </w:r>
-      <w:proofErr w:type="spellEnd"/>
-      <w:r>
-        <w:rPr>
-          <w:rFonts w:ascii="Times New Roman" w:hAnsi="Times New Roman" w:cs="Times New Roman"/>
-          <w:b/>
-          <w:bCs/>
-        </w:rPr>
-        <w:t xml:space="preserve"> Morphology:</w:t>
-      </w:r>
-      <w:r>
-        <w:rPr>
-          <w:rFonts w:ascii="Times New Roman" w:hAnsi="Times New Roman" w:cs="Times New Roman"/>
-        </w:rPr>
-        <w:t xml:space="preserve"> Eliminated. The entire cranial vault is consistently outside the bounding box of the dataset. Attempting to encode this will result in a 100% null/missing value rate.</w:t>
-      </w:r>
-    </w:p>
-    <w:p>
-      <w:pPr>
-        <w:numPr>
-          <w:ilvl w:val="0"/>
-          <w:numId w:val="10"/>
-        </w:numPr>
-        <w:rPr>
-          <w:rFonts w:ascii="Times New Roman" w:hAnsi="Times New Roman" w:cs="Times New Roman"/>
-        </w:rPr>
-      </w:pPr>
-      <w:r>
-        <w:rPr>
-          <w:rFonts w:ascii="Times New Roman" w:hAnsi="Times New Roman" w:cs="Times New Roman"/>
-          <w:b/>
-          <w:bCs/>
-        </w:rPr>
-        <w:t>Ear Margins:</w:t>
-      </w:r>
-      <w:r>
-        <w:rPr>
-          <w:rFonts w:ascii="Times New Roman" w:hAnsi="Times New Roman" w:cs="Times New Roman"/>
-        </w:rPr>
-        <w:t xml:space="preserve"> Eliminated. The pinnae are completely absent from the </w:t>
-      </w:r>
-      <w:proofErr w:type="spellStart"/>
-      <w:r>
-        <w:rPr>
-          <w:rFonts w:ascii="Times New Roman" w:hAnsi="Times New Roman" w:cs="Times New Roman"/>
-        </w:rPr>
-        <w:t>FoV</w:t>
-      </w:r>
-      <w:proofErr w:type="spellEnd"/>
-      <w:r>
-        <w:rPr>
-          <w:rFonts w:ascii="Times New Roman" w:hAnsi="Times New Roman" w:cs="Times New Roman"/>
-        </w:rPr>
-        <w:t>.</w:t>
-      </w:r>
-    </w:p>
-    <w:p>
-      <w:pPr>
-        <w:numPr>
-          <w:ilvl w:val="0"/>
-          <w:numId w:val="10"/>
-        </w:numPr>
-        <w:rPr>
-          <w:rFonts w:ascii="Times New Roman" w:hAnsi="Times New Roman" w:cs="Times New Roman"/>
-        </w:rPr>
-      </w:pPr>
-      <w:r>
-        <w:rPr>
-          <w:rFonts w:ascii="Times New Roman" w:hAnsi="Times New Roman" w:cs="Times New Roman"/>
-          <w:b/>
-          <w:bCs/>
-        </w:rPr>
-        <w:lastRenderedPageBreak/>
-        <w:t>Mane Contour:</w:t>
-      </w:r>
-      <w:r>
-        <w:rPr>
-          <w:rFonts w:ascii="Times New Roman" w:hAnsi="Times New Roman" w:cs="Times New Roman"/>
-        </w:rPr>
-        <w:t xml:space="preserve"> Eliminated. While the base of the dorsal ridge is marginally visible in a few samples (e.g., the third and final images), the clear, backlit silhouette required to accurately measure ridge linearity and hair gaps is absent. The background clutter and cropping make this an unreliable signal.</w:t>
-      </w:r>
-    </w:p>
-    <w:p>
-      <w:pPr>
-        <w:numPr>
-          <w:ilvl w:val="0"/>
-          <w:numId w:val="10"/>
-        </w:numPr>
-        <w:rPr>
-          <w:rFonts w:ascii="Times New Roman" w:hAnsi="Times New Roman" w:cs="Times New Roman"/>
-        </w:rPr>
-      </w:pPr>
-      <w:r>
-        <w:rPr>
-          <w:rFonts w:ascii="Times New Roman" w:hAnsi="Times New Roman" w:cs="Times New Roman"/>
-          <w:b/>
-          <w:bCs/>
-        </w:rPr>
-        <w:t>Acquired Traits (Extremities):</w:t>
-      </w:r>
-      <w:r>
-        <w:rPr>
-          <w:rFonts w:ascii="Times New Roman" w:hAnsi="Times New Roman" w:cs="Times New Roman"/>
-        </w:rPr>
-        <w:t xml:space="preserve"> Eliminated. Features such as lower-limb snare scars, amputated tails, or broken </w:t>
-      </w:r>
-      <w:proofErr w:type="spellStart"/>
-      <w:r>
-        <w:rPr>
-          <w:rFonts w:ascii="Times New Roman" w:hAnsi="Times New Roman" w:cs="Times New Roman"/>
-        </w:rPr>
-        <w:t>ossicones</w:t>
-      </w:r>
-      <w:proofErr w:type="spellEnd"/>
-      <w:r>
-        <w:rPr>
-          <w:rFonts w:ascii="Times New Roman" w:hAnsi="Times New Roman" w:cs="Times New Roman"/>
-        </w:rPr>
-        <w:t xml:space="preserve"> cannot be evaluated due to the strictly torso-centric crop.</w:t>
-      </w:r>
-    </w:p>
-    <w:p>
-      <w:pPr>
-        <w:rPr>
-          <w:rFonts w:ascii="Times New Roman" w:hAnsi="Times New Roman" w:cs="Times New Roman"/>
-          <w:b/>
-          <w:bCs/>
-        </w:rPr>
-      </w:pPr>
-      <w:r>
-        <w:rPr>
-          <w:rFonts w:ascii="Times New Roman" w:hAnsi="Times New Roman" w:cs="Times New Roman"/>
-          <w:b/>
-          <w:bCs/>
-        </w:rPr>
-        <w:t>Phase 2: Retention &amp; Refinement</w:t>
-      </w:r>
-    </w:p>
-    <w:p>
-      <w:pPr>
-        <w:rPr>
-          <w:rFonts w:ascii="Times New Roman" w:hAnsi="Times New Roman" w:cs="Times New Roman"/>
-        </w:rPr>
-      </w:pPr>
-      <w:r>
-        <w:rPr>
-          <w:rFonts w:ascii="Times New Roman" w:hAnsi="Times New Roman" w:cs="Times New Roman"/>
-        </w:rPr>
-        <w:t>The remaining features must be translated from biological descriptions into standardized, pixel-level morphological cues suitable for human annotators and convolutional architectures.</w:t>
-      </w:r>
-    </w:p>
-    <w:p>
-      <w:pPr>
-        <w:numPr>
-          <w:ilvl w:val="0"/>
-          <w:numId w:val="11"/>
-        </w:numPr>
-        <w:rPr>
-          <w:rFonts w:ascii="Times New Roman" w:hAnsi="Times New Roman" w:cs="Times New Roman"/>
-        </w:rPr>
-      </w:pPr>
-      <w:r>
-        <w:rPr>
-          <w:rFonts w:ascii="Times New Roman" w:hAnsi="Times New Roman" w:cs="Times New Roman"/>
-          <w:b/>
-          <w:bCs/>
-        </w:rPr>
-        <w:t>Pelage Network (Neck and Flank):</w:t>
-      </w:r>
-      <w:r>
-        <w:rPr>
-          <w:rFonts w:ascii="Times New Roman" w:hAnsi="Times New Roman" w:cs="Times New Roman"/>
-        </w:rPr>
-        <w:t xml:space="preserve"> This is the foundational biometric signature for this dataset.</w:t>
-      </w:r>
-    </w:p>
-    <w:p>
-      <w:pPr>
-        <w:numPr>
-          <w:ilvl w:val="1"/>
-          <w:numId w:val="11"/>
-        </w:numPr>
-        <w:rPr>
-          <w:rFonts w:ascii="Times New Roman" w:hAnsi="Times New Roman" w:cs="Times New Roman"/>
-        </w:rPr>
-      </w:pPr>
-      <w:r>
-        <w:rPr>
-          <w:rFonts w:ascii="Times New Roman" w:hAnsi="Times New Roman" w:cs="Times New Roman"/>
-          <w:i/>
-          <w:iCs/>
-        </w:rPr>
-        <w:t>Refinement:</w:t>
-      </w:r>
-      <w:r>
-        <w:rPr>
-          <w:rFonts w:ascii="Times New Roman" w:hAnsi="Times New Roman" w:cs="Times New Roman"/>
-        </w:rPr>
-        <w:t xml:space="preserve"> Absolute albedo or pigmentation metrics must be discarded due to severe variance in lighting and sensor exposure (contrast the washed-out exposure of the seventh image with the high contrast of the third). Instead, annotation must focus on </w:t>
-      </w:r>
-      <w:r>
-        <w:rPr>
-          <w:rFonts w:ascii="Times New Roman" w:hAnsi="Times New Roman" w:cs="Times New Roman"/>
-          <w:b/>
-          <w:bCs/>
-        </w:rPr>
-        <w:t>local gradient magnitude</w:t>
-      </w:r>
-      <w:r>
-        <w:rPr>
-          <w:rFonts w:ascii="Times New Roman" w:hAnsi="Times New Roman" w:cs="Times New Roman"/>
-        </w:rPr>
-        <w:t xml:space="preserve"> (the relative contrast between a patch and its immediate surrounding corridor) and </w:t>
-      </w:r>
-      <w:r>
-        <w:rPr>
-          <w:rFonts w:ascii="Times New Roman" w:hAnsi="Times New Roman" w:cs="Times New Roman"/>
-          <w:b/>
-          <w:bCs/>
-        </w:rPr>
-        <w:t>geometric topology</w:t>
-      </w:r>
-      <w:r>
-        <w:rPr>
-          <w:rFonts w:ascii="Times New Roman" w:hAnsi="Times New Roman" w:cs="Times New Roman"/>
-        </w:rPr>
-        <w:t>.</w:t>
-      </w:r>
-    </w:p>
-    <w:p>
-      <w:pPr>
-        <w:numPr>
-          <w:ilvl w:val="1"/>
-          <w:numId w:val="11"/>
-        </w:numPr>
-        <w:rPr>
-          <w:rFonts w:ascii="Times New Roman" w:hAnsi="Times New Roman" w:cs="Times New Roman"/>
-        </w:rPr>
-      </w:pPr>
-      <w:r>
-        <w:rPr>
-          <w:rFonts w:ascii="Times New Roman" w:hAnsi="Times New Roman" w:cs="Times New Roman"/>
-          <w:i/>
-          <w:iCs/>
-        </w:rPr>
-        <w:t>Conceptual Aid:</w:t>
-      </w:r>
-      <w:r>
-        <w:rPr>
-          <w:rFonts w:ascii="Times New Roman" w:hAnsi="Times New Roman" w:cs="Times New Roman"/>
-        </w:rPr>
-        <w:t xml:space="preserve"> Annotators should view the patch network similarly to </w:t>
-      </w:r>
-      <w:proofErr w:type="gramStart"/>
-      <w:r>
-        <w:rPr>
-          <w:rFonts w:ascii="Times New Roman" w:hAnsi="Times New Roman" w:cs="Times New Roman"/>
-        </w:rPr>
-        <w:t>a ,</w:t>
-      </w:r>
-      <w:proofErr w:type="gramEnd"/>
-      <w:r>
-        <w:rPr>
-          <w:rFonts w:ascii="Times New Roman" w:hAnsi="Times New Roman" w:cs="Times New Roman"/>
-        </w:rPr>
-        <w:t xml:space="preserve"> focusing on the continuous structural matrix of the </w:t>
-      </w:r>
-      <w:proofErr w:type="spellStart"/>
-      <w:r>
-        <w:rPr>
-          <w:rFonts w:ascii="Times New Roman" w:hAnsi="Times New Roman" w:cs="Times New Roman"/>
-        </w:rPr>
-        <w:t>light-colored</w:t>
-      </w:r>
-      <w:proofErr w:type="spellEnd"/>
-      <w:r>
-        <w:rPr>
-          <w:rFonts w:ascii="Times New Roman" w:hAnsi="Times New Roman" w:cs="Times New Roman"/>
-        </w:rPr>
-        <w:t xml:space="preserve"> connective corridors rather than just the isolated dark patches.</w:t>
-      </w:r>
-    </w:p>
-    <w:p>
-      <w:pPr>
-        <w:numPr>
-          <w:ilvl w:val="0"/>
-          <w:numId w:val="11"/>
-        </w:numPr>
-        <w:rPr>
-          <w:rFonts w:ascii="Times New Roman" w:hAnsi="Times New Roman" w:cs="Times New Roman"/>
-        </w:rPr>
-      </w:pPr>
-      <w:r>
-        <w:rPr>
-          <w:rFonts w:ascii="Times New Roman" w:hAnsi="Times New Roman" w:cs="Times New Roman"/>
-          <w:b/>
-          <w:bCs/>
-        </w:rPr>
-        <w:t>Acquired Traits / Anomalies (Surface-Level):</w:t>
-      </w:r>
-      <w:r>
-        <w:rPr>
-          <w:rFonts w:ascii="Times New Roman" w:hAnsi="Times New Roman" w:cs="Times New Roman"/>
-        </w:rPr>
-        <w:t xml:space="preserve"> Highly viable as secondary identifiers.</w:t>
-      </w:r>
-    </w:p>
-    <w:p>
-      <w:pPr>
-        <w:numPr>
-          <w:ilvl w:val="1"/>
-          <w:numId w:val="11"/>
-        </w:numPr>
-        <w:rPr>
-          <w:rFonts w:ascii="Times New Roman" w:hAnsi="Times New Roman" w:cs="Times New Roman"/>
-        </w:rPr>
-      </w:pPr>
-      <w:r>
-        <w:rPr>
-          <w:rFonts w:ascii="Times New Roman" w:hAnsi="Times New Roman" w:cs="Times New Roman"/>
-          <w:i/>
-          <w:iCs/>
-        </w:rPr>
-        <w:t>Refinement:</w:t>
-      </w:r>
-      <w:r>
-        <w:rPr>
-          <w:rFonts w:ascii="Times New Roman" w:hAnsi="Times New Roman" w:cs="Times New Roman"/>
-        </w:rPr>
-        <w:t xml:space="preserve"> The dataset explicitly exhibits high instances of symbiotic interaction and associated trauma (oxpeckers are clearly visible clinging to the flanks in several images). We must refine this category to focus strictly on localized texture anomalies and occlusions on the visible dermis, such as chronic tickbird feeding lesions or hyper-pigmented scar nodes.</w:t>
-      </w:r>
-    </w:p>
-    <w:p>
-      <w:pPr>
-        <w:rPr>
-          <w:rFonts w:ascii="Times New Roman" w:hAnsi="Times New Roman" w:cs="Times New Roman"/>
-        </w:rPr>
-      </w:pPr>
-      <w:r>
-        <w:rPr>
-          <w:rFonts w:ascii="Times New Roman" w:hAnsi="Times New Roman" w:cs="Times New Roman"/>
-        </w:rPr>
-        <w:pict w14:anchorId="10B07BC1">
-          <v:rect id="_x0000_i1025" style="width:0;height:1.5pt" o:hralign="center" o:hrstd="t" o:hr="t" fillcolor="#a0a0a0" stroked="f"/>
-        </w:pict>
-      </w:r>
-    </w:p>
-    <w:p>
-      <w:pPr>
-        <w:rPr>
-          <w:rFonts w:ascii="Times New Roman" w:hAnsi="Times New Roman" w:cs="Times New Roman"/>
-          <w:b/>
-          <w:bCs/>
-        </w:rPr>
-      </w:pPr>
-      <w:r>
-        <w:rPr>
-          <w:rFonts w:ascii="Times New Roman" w:hAnsi="Times New Roman" w:cs="Times New Roman"/>
-          <w:b/>
-          <w:bCs/>
-        </w:rPr>
-        <w:t>Phase 3: The Viable Ontology ($D_{viable}$)</w:t>
-      </w:r>
-    </w:p>
-    <w:p>
-      <w:pPr>
-        <w:rPr>
-          <w:rFonts w:ascii="Times New Roman" w:hAnsi="Times New Roman" w:cs="Times New Roman"/>
-        </w:rPr>
-      </w:pPr>
-      <w:r>
-        <w:rPr>
-          <w:rFonts w:ascii="Times New Roman" w:hAnsi="Times New Roman" w:cs="Times New Roman"/>
-        </w:rPr>
-        <w:t>Based strictly on the visual reality of the dataset, the ontology is compressed and refined into the following executable standard:</w:t>
-      </w:r>
-    </w:p>
-    <w:p>
-      <w:pPr>
-        <w:rPr>
-          <w:rFonts w:ascii="Times New Roman" w:hAnsi="Times New Roman" w:cs="Times New Roman"/>
-        </w:rPr>
-      </w:pPr>
-      <w:r>
-        <w:rPr>
-          <w:rFonts w:ascii="Times New Roman" w:hAnsi="Times New Roman" w:cs="Times New Roman"/>
-          <w:b/>
-          <w:bCs/>
-        </w:rPr>
-        <w:t>1. Pelage Structural Matrix (Primary Modality)</w:t>
-      </w:r>
-    </w:p>
-    <w:p>
-      <w:pPr>
-        <w:numPr>
-          <w:ilvl w:val="0"/>
-          <w:numId w:val="12"/>
-        </w:numPr>
-        <w:rPr>
-          <w:rFonts w:ascii="Times New Roman" w:hAnsi="Times New Roman" w:cs="Times New Roman"/>
-        </w:rPr>
-      </w:pPr>
-      <w:r>
-        <w:rPr>
-          <w:rFonts w:ascii="Times New Roman" w:hAnsi="Times New Roman" w:cs="Times New Roman"/>
-          <w:b/>
-          <w:bCs/>
-        </w:rPr>
-        <w:t>Polygon Edge Morphology:</w:t>
-      </w:r>
-      <w:r>
-        <w:rPr>
-          <w:rFonts w:ascii="Times New Roman" w:hAnsi="Times New Roman" w:cs="Times New Roman"/>
-        </w:rPr>
-        <w:t xml:space="preserve"> Classification of the bounding edges of the individual dark patches (e.g., high-frequency jagged edges vs. low-frequency smooth, lobed edges).</w:t>
-      </w:r>
-    </w:p>
-    <w:p>
-      <w:pPr>
-        <w:numPr>
-          <w:ilvl w:val="0"/>
-          <w:numId w:val="12"/>
-        </w:numPr>
-        <w:rPr>
-          <w:rFonts w:ascii="Times New Roman" w:hAnsi="Times New Roman" w:cs="Times New Roman"/>
-        </w:rPr>
-      </w:pPr>
-      <w:r>
-        <w:rPr>
-          <w:rFonts w:ascii="Times New Roman" w:hAnsi="Times New Roman" w:cs="Times New Roman"/>
-          <w:b/>
-          <w:bCs/>
-        </w:rPr>
-        <w:lastRenderedPageBreak/>
-        <w:t>Corridor Topology:</w:t>
-      </w:r>
-      <w:r>
-        <w:rPr>
-          <w:rFonts w:ascii="Times New Roman" w:hAnsi="Times New Roman" w:cs="Times New Roman"/>
-        </w:rPr>
-        <w:t xml:space="preserve"> The geometric continuity, relative pixel width, and intersection angles of the light connective tissue separating the primary patches.</w:t>
-      </w:r>
-    </w:p>
-    <w:p>
-      <w:pPr>
-        <w:numPr>
-          <w:ilvl w:val="0"/>
-          <w:numId w:val="12"/>
-        </w:numPr>
-        <w:rPr>
-          <w:rFonts w:ascii="Times New Roman" w:hAnsi="Times New Roman" w:cs="Times New Roman"/>
-        </w:rPr>
-      </w:pPr>
-      <w:r>
-        <w:rPr>
-          <w:rFonts w:ascii="Times New Roman" w:hAnsi="Times New Roman" w:cs="Times New Roman"/>
-          <w:b/>
-          <w:bCs/>
-        </w:rPr>
-        <w:t>Relative Intensity Gradient:</w:t>
-      </w:r>
-      <w:r>
-        <w:rPr>
-          <w:rFonts w:ascii="Times New Roman" w:hAnsi="Times New Roman" w:cs="Times New Roman"/>
-        </w:rPr>
-        <w:t xml:space="preserve"> The measurable pixel intensity difference calculated locally between the centroid of a dark patch and its bounding light corridor (to normalize for global lighting variance).</w:t>
-      </w:r>
-    </w:p>
-    <w:p>
-      <w:pPr>
-        <w:rPr>
-          <w:rFonts w:ascii="Times New Roman" w:hAnsi="Times New Roman" w:cs="Times New Roman"/>
-        </w:rPr>
-      </w:pPr>
-      <w:r>
-        <w:rPr>
-          <w:rFonts w:ascii="Times New Roman" w:hAnsi="Times New Roman" w:cs="Times New Roman"/>
-          <w:b/>
-          <w:bCs/>
-        </w:rPr>
-        <w:t>2. Surface-Level Topographical Anomalies (Secondary Modality)</w:t>
-      </w:r>
-    </w:p>
-    <w:p>
-      <w:pPr>
-        <w:numPr>
-          <w:ilvl w:val="0"/>
-          <w:numId w:val="13"/>
-        </w:numPr>
-        <w:rPr>
-          <w:rFonts w:ascii="Times New Roman" w:hAnsi="Times New Roman" w:cs="Times New Roman"/>
-        </w:rPr>
-      </w:pPr>
-      <w:r>
-        <w:rPr>
-          <w:rFonts w:ascii="Times New Roman" w:hAnsi="Times New Roman" w:cs="Times New Roman"/>
-          <w:b/>
-          <w:bCs/>
-        </w:rPr>
-        <w:t>Symbiotic/Parasitic Occlusion:</w:t>
-      </w:r>
-      <w:r>
-        <w:rPr>
-          <w:rFonts w:ascii="Times New Roman" w:hAnsi="Times New Roman" w:cs="Times New Roman"/>
-        </w:rPr>
-        <w:t xml:space="preserve"> Detection of oxpeckers or similar fauna adhering to the flank, acting as temporal identifying markers.</w:t>
-      </w:r>
-    </w:p>
-    <w:p>
-      <w:pPr>
-        <w:numPr>
-          <w:ilvl w:val="0"/>
-          <w:numId w:val="13"/>
-        </w:numPr>
-        <w:rPr>
-          <w:rFonts w:ascii="Times New Roman" w:hAnsi="Times New Roman" w:cs="Times New Roman"/>
-        </w:rPr>
-      </w:pPr>
-      <w:r>
-        <w:rPr>
-          <w:rFonts w:ascii="Times New Roman" w:hAnsi="Times New Roman" w:cs="Times New Roman"/>
-          <w:b/>
-          <w:bCs/>
-        </w:rPr>
-        <w:t>Chronic Epidermal Lesions:</w:t>
-      </w:r>
-      <w:r>
-        <w:rPr>
-          <w:rFonts w:ascii="Times New Roman" w:hAnsi="Times New Roman" w:cs="Times New Roman"/>
-        </w:rPr>
-        <w:t xml:space="preserve"> Identification of static, localized disruptions in the pelage pattern, manifesting as hyper-pigmented spots, visible scarring, or depressed topographical nodes (commonly resulting from continuous oxpecker feeding at tick sites).</w:t>
-      </w:r>
-    </w:p>
-    <w:p>
-      <w:pPr>
-        <w:pBdr>
-          <w:bottom w:val="single" w:sz="6" w:space="1" w:color="auto"/>
-        </w:pBdr>
-        <w:rPr>
-          <w:rFonts w:ascii="Times New Roman" w:hAnsi="Times New Roman" w:cs="Times New Roman"/>
-        </w:rPr>
-      </w:pPr>
-    </w:p>
-    <w:p>
-      <w:pPr>
-        <w:rPr>
-          <w:rFonts w:ascii="Times New Roman" w:hAnsi="Times New Roman" w:cs="Times New Roman"/>
-        </w:rPr>
-      </w:pPr>
-      <w:r>
-        <w:rPr>
-          <w:rFonts w:ascii="Times New Roman" w:hAnsi="Times New Roman" w:cs="Times New Roman" w:hint="eastAsia"/>
-        </w:rPr>
-        <w:t xml:space="preserve"># </w:t>
-      </w:r>
-      <w:r>
-        <w:rPr>
-          <w:rFonts w:ascii="Times New Roman" w:hAnsi="Times New Roman" w:cs="Times New Roman" w:hint="eastAsia"/>
-          <w:b/>
-          <w:bCs/>
-        </w:rPr>
-        <w:t>Single Image Extraction</w:t>
-      </w:r>
-    </w:p>
-    <w:p>
-      <w:pPr>
-        <w:rPr>
-          <w:rFonts w:ascii="Times New Roman" w:hAnsi="Times New Roman" w:cs="Times New Roman"/>
-        </w:rPr>
-      </w:pPr>
-      <w:r>
-        <w:rPr>
-          <w:rFonts w:ascii="Times New Roman" w:hAnsi="Times New Roman" w:cs="Times New Roman"/>
-          <w:b/>
-          <w:bCs/>
-        </w:rPr>
-        <w:t>Role:</w:t>
-      </w:r>
-      <w:r>
-        <w:rPr>
-          <w:rFonts w:ascii="Times New Roman" w:hAnsi="Times New Roman" w:cs="Times New Roman"/>
-        </w:rPr>
-        <w:t xml:space="preserve"> You are a precise computer vision data annotator extracting fine-grained biometric features for an Animal Re-Identification benchmark.</w:t>
-      </w:r>
-    </w:p>
-    <w:p>
-      <w:pPr>
-        <w:rPr>
-          <w:rFonts w:ascii="Times New Roman" w:hAnsi="Times New Roman" w:cs="Times New Roman"/>
-        </w:rPr>
-      </w:pPr>
-      <w:r>
-        <w:rPr>
-          <w:rFonts w:ascii="Times New Roman" w:hAnsi="Times New Roman" w:cs="Times New Roman"/>
-          <w:b/>
-          <w:bCs/>
-        </w:rPr>
-        <w:t>Task:</w:t>
-      </w:r>
-      <w:r>
-        <w:rPr>
-          <w:rFonts w:ascii="Times New Roman" w:hAnsi="Times New Roman" w:cs="Times New Roman"/>
-        </w:rPr>
-        <w:t xml:space="preserve"> </w:t>
-      </w:r>
-      <w:proofErr w:type="spellStart"/>
-      <w:r>
-        <w:rPr>
-          <w:rFonts w:ascii="Times New Roman" w:hAnsi="Times New Roman" w:cs="Times New Roman"/>
-        </w:rPr>
-        <w:t>Analyze</w:t>
-      </w:r>
-      <w:proofErr w:type="spellEnd"/>
-      <w:r>
-        <w:rPr>
-          <w:rFonts w:ascii="Times New Roman" w:hAnsi="Times New Roman" w:cs="Times New Roman"/>
-        </w:rPr>
-        <w:t xml:space="preserve"> the provided camera trap image of a giraffe's torso/flank. Extract its visual features strictly according to the defined JSON schema below.</w:t>
-      </w:r>
-    </w:p>
-    <w:p>
-      <w:pPr>
-        <w:rPr>
-          <w:rFonts w:ascii="Times New Roman" w:hAnsi="Times New Roman" w:cs="Times New Roman"/>
-        </w:rPr>
-      </w:pPr>
-      <w:r>
-        <w:rPr>
-          <w:rFonts w:ascii="Times New Roman" w:hAnsi="Times New Roman" w:cs="Times New Roman"/>
-          <w:b/>
-          <w:bCs/>
-        </w:rPr>
-        <w:t>Strict Rules for Extraction:</w:t>
-      </w:r>
-    </w:p>
-    <w:p>
-      <w:pPr>
-        <w:numPr>
-          <w:ilvl w:val="0"/>
-          <w:numId w:val="16"/>
-        </w:numPr>
-        <w:rPr>
-          <w:rFonts w:ascii="Times New Roman" w:hAnsi="Times New Roman" w:cs="Times New Roman"/>
-        </w:rPr>
-      </w:pPr>
-      <w:r>
-        <w:rPr>
-          <w:rFonts w:ascii="Times New Roman" w:hAnsi="Times New Roman" w:cs="Times New Roman"/>
-          <w:b/>
-          <w:bCs/>
-        </w:rPr>
-        <w:t>No Hallucinations (The Null Rule):</w:t>
-      </w:r>
-      <w:r>
-        <w:rPr>
-          <w:rFonts w:ascii="Times New Roman" w:hAnsi="Times New Roman" w:cs="Times New Roman"/>
-        </w:rPr>
-        <w:t xml:space="preserve"> If a specific feature is blurry, occluded by shadows/foliage, or simply out of the camera's Field of View in this specific image, you MUST output null for that field. Do not guess based on typical giraffe appearances.</w:t>
-      </w:r>
-    </w:p>
-    <w:p>
-      <w:pPr>
-        <w:numPr>
-          <w:ilvl w:val="0"/>
-          <w:numId w:val="16"/>
-        </w:numPr>
-        <w:rPr>
-          <w:rFonts w:ascii="Times New Roman" w:hAnsi="Times New Roman" w:cs="Times New Roman"/>
-        </w:rPr>
-      </w:pPr>
-      <w:r>
-        <w:rPr>
-          <w:rFonts w:ascii="Times New Roman" w:hAnsi="Times New Roman" w:cs="Times New Roman"/>
-          <w:b/>
-          <w:bCs/>
-        </w:rPr>
-        <w:t>Focus on Localized Details:</w:t>
-      </w:r>
-      <w:r>
-        <w:rPr>
-          <w:rFonts w:ascii="Times New Roman" w:hAnsi="Times New Roman" w:cs="Times New Roman"/>
-        </w:rPr>
-        <w:t xml:space="preserve"> Do not describe the whole animal. Describe only the localized crops.</w:t>
-      </w:r>
-    </w:p>
-    <w:p>
-      <w:pPr>
-        <w:numPr>
-          <w:ilvl w:val="0"/>
-          <w:numId w:val="16"/>
-        </w:numPr>
-        <w:rPr>
-          <w:rFonts w:ascii="Times New Roman" w:hAnsi="Times New Roman" w:cs="Times New Roman"/>
-        </w:rPr>
-      </w:pPr>
-      <w:r>
-        <w:rPr>
-          <w:rFonts w:ascii="Times New Roman" w:hAnsi="Times New Roman" w:cs="Times New Roman"/>
-          <w:b/>
-          <w:bCs/>
-        </w:rPr>
-        <w:t>Definitions:</w:t>
-      </w:r>
-    </w:p>
-    <w:p>
-      <w:pPr>
-        <w:numPr>
-          <w:ilvl w:val="1"/>
-          <w:numId w:val="16"/>
-        </w:numPr>
-        <w:rPr>
-          <w:rFonts w:ascii="Times New Roman" w:hAnsi="Times New Roman" w:cs="Times New Roman"/>
-        </w:rPr>
-      </w:pPr>
-      <w:proofErr w:type="spellStart"/>
-      <w:r>
-        <w:rPr>
-          <w:rFonts w:ascii="Times New Roman" w:hAnsi="Times New Roman" w:cs="Times New Roman"/>
-        </w:rPr>
-        <w:t>polygon_edge_morphology</w:t>
-      </w:r>
-      <w:proofErr w:type="spellEnd"/>
-      <w:r>
-        <w:rPr>
-          <w:rFonts w:ascii="Times New Roman" w:hAnsi="Times New Roman" w:cs="Times New Roman"/>
-        </w:rPr>
-        <w:t>: Describe the bounding edges of the dark patches (e.g., "high-frequency jagged", "smooth", "lobed").</w:t>
-      </w:r>
-    </w:p>
-    <w:p>
-      <w:pPr>
-        <w:numPr>
-          <w:ilvl w:val="1"/>
-          <w:numId w:val="16"/>
-        </w:numPr>
-        <w:rPr>
-          <w:rFonts w:ascii="Times New Roman" w:hAnsi="Times New Roman" w:cs="Times New Roman"/>
-        </w:rPr>
-      </w:pPr>
-      <w:proofErr w:type="spellStart"/>
-      <w:r>
-        <w:rPr>
-          <w:rFonts w:ascii="Times New Roman" w:hAnsi="Times New Roman" w:cs="Times New Roman"/>
-        </w:rPr>
-        <w:t>corridor_topology</w:t>
-      </w:r>
-      <w:proofErr w:type="spellEnd"/>
-      <w:r>
-        <w:rPr>
-          <w:rFonts w:ascii="Times New Roman" w:hAnsi="Times New Roman" w:cs="Times New Roman"/>
-        </w:rPr>
-        <w:t>: Describe the light connective tissue lines between patches (e.g., "thick continuous lines", "broken thin segments", "Y-shaped intersections").</w:t>
-      </w:r>
-    </w:p>
-    <w:p>
-      <w:pPr>
-        <w:numPr>
-          <w:ilvl w:val="1"/>
-          <w:numId w:val="16"/>
-        </w:numPr>
-        <w:rPr>
-          <w:rFonts w:ascii="Times New Roman" w:hAnsi="Times New Roman" w:cs="Times New Roman"/>
-        </w:rPr>
-      </w:pPr>
-      <w:proofErr w:type="spellStart"/>
-      <w:r>
-        <w:rPr>
-          <w:rFonts w:ascii="Times New Roman" w:hAnsi="Times New Roman" w:cs="Times New Roman"/>
-        </w:rPr>
-        <w:t>relative_intensity_gradient</w:t>
-      </w:r>
-      <w:proofErr w:type="spellEnd"/>
-      <w:r>
-        <w:rPr>
-          <w:rFonts w:ascii="Times New Roman" w:hAnsi="Times New Roman" w:cs="Times New Roman"/>
-        </w:rPr>
-        <w:t>: Describe the local contrast (e.g., "high contrast between dark brown centroid and pale corridor", "washed-out low contrast").</w:t>
-      </w:r>
-    </w:p>
-    <w:p>
-      <w:pPr>
-        <w:numPr>
-          <w:ilvl w:val="1"/>
-          <w:numId w:val="16"/>
-        </w:numPr>
-        <w:rPr>
-          <w:rFonts w:ascii="Times New Roman" w:hAnsi="Times New Roman" w:cs="Times New Roman"/>
-        </w:rPr>
-      </w:pPr>
-      <w:proofErr w:type="spellStart"/>
-      <w:r>
-        <w:rPr>
-          <w:rFonts w:ascii="Times New Roman" w:hAnsi="Times New Roman" w:cs="Times New Roman"/>
-        </w:rPr>
-        <w:t>symbiotic_parasitic_occlusion</w:t>
-      </w:r>
-      <w:proofErr w:type="spellEnd"/>
-      <w:r>
-        <w:rPr>
-          <w:rFonts w:ascii="Times New Roman" w:hAnsi="Times New Roman" w:cs="Times New Roman"/>
-        </w:rPr>
-        <w:t>: Mention any visible tickbirds (oxpeckers) or distinct temporal occlusions. Output null if none.</w:t>
-      </w:r>
-    </w:p>
-    <w:p>
-      <w:pPr>
-        <w:numPr>
-          <w:ilvl w:val="1"/>
-          <w:numId w:val="16"/>
-        </w:numPr>
-        <w:rPr>
-          <w:rFonts w:ascii="Times New Roman" w:hAnsi="Times New Roman" w:cs="Times New Roman"/>
-        </w:rPr>
-      </w:pPr>
-      <w:proofErr w:type="spellStart"/>
-      <w:r>
-        <w:rPr>
-          <w:rFonts w:ascii="Times New Roman" w:hAnsi="Times New Roman" w:cs="Times New Roman"/>
-        </w:rPr>
-        <w:lastRenderedPageBreak/>
-        <w:t>chronic_epidermal_lesions</w:t>
-      </w:r>
-      <w:proofErr w:type="spellEnd"/>
-      <w:r>
-        <w:rPr>
-          <w:rFonts w:ascii="Times New Roman" w:hAnsi="Times New Roman" w:cs="Times New Roman"/>
-        </w:rPr>
-        <w:t>: Describe any static topographical nodes, hyper-pigmented spots, or visible scarring. Output null if the coat is clean.</w:t>
-      </w:r>
-    </w:p>
-    <w:p>
-      <w:pPr>
-        <w:numPr>
-          <w:ilvl w:val="1"/>
-          <w:numId w:val="16"/>
-        </w:numPr>
-        <w:rPr>
-          <w:rFonts w:ascii="Times New Roman" w:hAnsi="Times New Roman" w:cs="Times New Roman"/>
-        </w:rPr>
-      </w:pPr>
-      <w:proofErr w:type="spellStart"/>
-      <w:r>
-        <w:rPr>
-          <w:rFonts w:ascii="Times New Roman" w:hAnsi="Times New Roman" w:cs="Times New Roman"/>
-        </w:rPr>
-        <w:t>other_distinctive_markers</w:t>
-      </w:r>
-      <w:proofErr w:type="spellEnd"/>
-      <w:r>
-        <w:rPr>
-          <w:rFonts w:ascii="Times New Roman" w:hAnsi="Times New Roman" w:cs="Times New Roman"/>
-        </w:rPr>
-        <w:t>: Any highly unique feature NOT covered above.</w:t>
-      </w:r>
-    </w:p>
-    <w:p>
-      <w:pPr>
-        <w:rPr>
-          <w:rFonts w:ascii="Times New Roman" w:hAnsi="Times New Roman" w:cs="Times New Roman"/>
-        </w:rPr>
-      </w:pPr>
-      <w:r>
-        <w:rPr>
-          <w:rFonts w:ascii="Times New Roman" w:hAnsi="Times New Roman" w:cs="Times New Roman"/>
-          <w:b/>
-          <w:bCs/>
-        </w:rPr>
-        <w:t>Output Format:</w:t>
-      </w:r>
-      <w:r>
-        <w:rPr>
-          <w:rFonts w:ascii="Times New Roman" w:hAnsi="Times New Roman" w:cs="Times New Roman"/>
-        </w:rPr>
-        <w:t xml:space="preserve"> Return ONLY a valid JSON object matching this schema. Do not include markdown formatting or explanatory text.</w:t>
-      </w:r>
-    </w:p>
-    <w:p>
-      <w:pPr>
-        <w:rPr>
-          <w:rFonts w:ascii="Times New Roman" w:hAnsi="Times New Roman" w:cs="Times New Roman"/>
-        </w:rPr>
-      </w:pPr>
-      <w:r>
-        <w:rPr>
-          <w:rFonts w:ascii="Times New Roman" w:hAnsi="Times New Roman" w:cs="Times New Roman"/>
-        </w:rPr>
-        <w:t>JSON</w:t>
-      </w:r>
-    </w:p>
-    <w:p>
-      <w:pPr>
-        <w:rPr>
-          <w:rFonts w:ascii="Times New Roman" w:hAnsi="Times New Roman" w:cs="Times New Roman"/>
-        </w:rPr>
-      </w:pPr>
-      <w:r>
-        <w:rPr>
-          <w:rFonts w:ascii="Times New Roman" w:hAnsi="Times New Roman" w:cs="Times New Roman"/>
-        </w:rPr>
-        <w:t>{</w:t>
-      </w:r>
-    </w:p>
-    <w:p>
-      <w:pPr>
-        <w:rPr>
-          <w:rFonts w:ascii="Times New Roman" w:hAnsi="Times New Roman" w:cs="Times New Roman"/>
-        </w:rPr>
-      </w:pPr>
-      <w:r>
-        <w:rPr>
-          <w:rFonts w:ascii="Times New Roman" w:hAnsi="Times New Roman" w:cs="Times New Roman"/>
-        </w:rPr>
-        <w:t xml:space="preserve">  "</w:t>
-      </w:r>
-      <w:proofErr w:type="spellStart"/>
-      <w:proofErr w:type="gramStart"/>
-      <w:r>
-        <w:rPr>
-          <w:rFonts w:ascii="Times New Roman" w:hAnsi="Times New Roman" w:cs="Times New Roman"/>
-        </w:rPr>
-        <w:t>pelage</w:t>
-      </w:r>
-      <w:proofErr w:type="gramEnd"/>
-      <w:r>
-        <w:rPr>
-          <w:rFonts w:ascii="Times New Roman" w:hAnsi="Times New Roman" w:cs="Times New Roman"/>
-        </w:rPr>
-        <w:t>_structural_matrix</w:t>
-      </w:r>
-      <w:proofErr w:type="spellEnd"/>
-      <w:r>
-        <w:rPr>
-          <w:rFonts w:ascii="Times New Roman" w:hAnsi="Times New Roman" w:cs="Times New Roman"/>
-        </w:rPr>
-        <w:t>": {</w:t>
-      </w:r>
-    </w:p>
-    <w:p>
-      <w:pPr>
-        <w:rPr>
-          <w:rFonts w:ascii="Times New Roman" w:hAnsi="Times New Roman" w:cs="Times New Roman"/>
-        </w:rPr>
-      </w:pPr>
-      <w:r>
-        <w:rPr>
-          <w:rFonts w:ascii="Times New Roman" w:hAnsi="Times New Roman" w:cs="Times New Roman"/>
-        </w:rPr>
-        <w:t xml:space="preserve">    "</w:t>
-      </w:r>
-      <w:proofErr w:type="spellStart"/>
-      <w:proofErr w:type="gramStart"/>
-      <w:r>
-        <w:rPr>
-          <w:rFonts w:ascii="Times New Roman" w:hAnsi="Times New Roman" w:cs="Times New Roman"/>
-        </w:rPr>
-        <w:t>polygon</w:t>
-      </w:r>
-      <w:proofErr w:type="gramEnd"/>
-      <w:r>
-        <w:rPr>
-          <w:rFonts w:ascii="Times New Roman" w:hAnsi="Times New Roman" w:cs="Times New Roman"/>
-        </w:rPr>
-        <w:t>_edge_morphology</w:t>
-      </w:r>
-      <w:proofErr w:type="spellEnd"/>
-      <w:r>
-        <w:rPr>
-          <w:rFonts w:ascii="Times New Roman" w:hAnsi="Times New Roman" w:cs="Times New Roman"/>
-        </w:rPr>
-        <w:t xml:space="preserve">": "...", </w:t>
-      </w:r>
-    </w:p>
-    <w:p>
-      <w:pPr>
-        <w:rPr>
-          <w:rFonts w:ascii="Times New Roman" w:hAnsi="Times New Roman" w:cs="Times New Roman"/>
-        </w:rPr>
-      </w:pPr>
-      <w:r>
-        <w:rPr>
-          <w:rFonts w:ascii="Times New Roman" w:hAnsi="Times New Roman" w:cs="Times New Roman"/>
-        </w:rPr>
-        <w:t xml:space="preserve">    "</w:t>
-      </w:r>
-      <w:proofErr w:type="spellStart"/>
-      <w:proofErr w:type="gramStart"/>
-      <w:r>
-        <w:rPr>
-          <w:rFonts w:ascii="Times New Roman" w:hAnsi="Times New Roman" w:cs="Times New Roman"/>
-        </w:rPr>
-        <w:t>corridor</w:t>
-      </w:r>
-      <w:proofErr w:type="gramEnd"/>
-      <w:r>
-        <w:rPr>
-          <w:rFonts w:ascii="Times New Roman" w:hAnsi="Times New Roman" w:cs="Times New Roman"/>
-        </w:rPr>
-        <w:t>_topology</w:t>
-      </w:r>
-      <w:proofErr w:type="spellEnd"/>
-      <w:r>
-        <w:rPr>
-          <w:rFonts w:ascii="Times New Roman" w:hAnsi="Times New Roman" w:cs="Times New Roman"/>
-        </w:rPr>
-        <w:t>": "...",</w:t>
-      </w:r>
-    </w:p>
-    <w:p>
-      <w:pPr>
-        <w:rPr>
-          <w:rFonts w:ascii="Times New Roman" w:hAnsi="Times New Roman" w:cs="Times New Roman"/>
-        </w:rPr>
-      </w:pPr>
-      <w:r>
-        <w:rPr>
-          <w:rFonts w:ascii="Times New Roman" w:hAnsi="Times New Roman" w:cs="Times New Roman"/>
-        </w:rPr>
-        <w:t xml:space="preserve">    "</w:t>
-      </w:r>
-      <w:proofErr w:type="spellStart"/>
-      <w:proofErr w:type="gramStart"/>
-      <w:r>
-        <w:rPr>
-          <w:rFonts w:ascii="Times New Roman" w:hAnsi="Times New Roman" w:cs="Times New Roman"/>
-        </w:rPr>
-        <w:t>relative</w:t>
-      </w:r>
-      <w:proofErr w:type="gramEnd"/>
-      <w:r>
-        <w:rPr>
-          <w:rFonts w:ascii="Times New Roman" w:hAnsi="Times New Roman" w:cs="Times New Roman"/>
-        </w:rPr>
-        <w:t>_intensity_gradient</w:t>
-      </w:r>
-      <w:proofErr w:type="spellEnd"/>
-      <w:r>
-        <w:rPr>
-          <w:rFonts w:ascii="Times New Roman" w:hAnsi="Times New Roman" w:cs="Times New Roman"/>
-        </w:rPr>
-        <w:t>": "..."</w:t>
-      </w:r>
-    </w:p>
-    <w:p>
-      <w:pPr>
-        <w:rPr>
-          <w:rFonts w:ascii="Times New Roman" w:hAnsi="Times New Roman" w:cs="Times New Roman"/>
-        </w:rPr>
-      </w:pPr>
-      <w:r>
-        <w:rPr>
-          <w:rFonts w:ascii="Times New Roman" w:hAnsi="Times New Roman" w:cs="Times New Roman"/>
-        </w:rPr>
-        <w:t xml:space="preserve">  },</w:t>
-      </w:r>
-    </w:p>
-    <w:p>
-      <w:pPr>
-        <w:rPr>
-          <w:rFonts w:ascii="Times New Roman" w:hAnsi="Times New Roman" w:cs="Times New Roman"/>
-        </w:rPr>
-      </w:pPr>
-      <w:r>
-        <w:rPr>
-          <w:rFonts w:ascii="Times New Roman" w:hAnsi="Times New Roman" w:cs="Times New Roman"/>
-        </w:rPr>
-        <w:t xml:space="preserve">  "</w:t>
-      </w:r>
-      <w:proofErr w:type="spellStart"/>
-      <w:proofErr w:type="gramStart"/>
-      <w:r>
-        <w:rPr>
-          <w:rFonts w:ascii="Times New Roman" w:hAnsi="Times New Roman" w:cs="Times New Roman"/>
-        </w:rPr>
-        <w:t>surface</w:t>
-      </w:r>
-      <w:proofErr w:type="gramEnd"/>
-      <w:r>
-        <w:rPr>
-          <w:rFonts w:ascii="Times New Roman" w:hAnsi="Times New Roman" w:cs="Times New Roman"/>
-        </w:rPr>
-        <w:t>_topographical_anomalies</w:t>
-      </w:r>
-      <w:proofErr w:type="spellEnd"/>
-      <w:r>
-        <w:rPr>
-          <w:rFonts w:ascii="Times New Roman" w:hAnsi="Times New Roman" w:cs="Times New Roman"/>
-        </w:rPr>
-        <w:t>": {</w:t>
-      </w:r>
-    </w:p>
-    <w:p>
-      <w:pPr>
-        <w:rPr>
-          <w:rFonts w:ascii="Times New Roman" w:hAnsi="Times New Roman" w:cs="Times New Roman"/>
-        </w:rPr>
-      </w:pPr>
-      <w:r>
-        <w:rPr>
-          <w:rFonts w:ascii="Times New Roman" w:hAnsi="Times New Roman" w:cs="Times New Roman"/>
-        </w:rPr>
-        <w:t xml:space="preserve">    "</w:t>
-      </w:r>
-      <w:proofErr w:type="spellStart"/>
-      <w:proofErr w:type="gramStart"/>
-      <w:r>
-        <w:rPr>
-          <w:rFonts w:ascii="Times New Roman" w:hAnsi="Times New Roman" w:cs="Times New Roman"/>
-        </w:rPr>
-        <w:t>symbiotic</w:t>
-      </w:r>
-      <w:proofErr w:type="gramEnd"/>
-      <w:r>
-        <w:rPr>
-          <w:rFonts w:ascii="Times New Roman" w:hAnsi="Times New Roman" w:cs="Times New Roman"/>
-        </w:rPr>
-        <w:t>_parasitic_occlusion</w:t>
-      </w:r>
-      <w:proofErr w:type="spellEnd"/>
-      <w:r>
-        <w:rPr>
-          <w:rFonts w:ascii="Times New Roman" w:hAnsi="Times New Roman" w:cs="Times New Roman"/>
-        </w:rPr>
-        <w:t>": "...",</w:t>
-      </w:r>
-    </w:p>
-    <w:p>
-      <w:pPr>
-        <w:rPr>
-          <w:rFonts w:ascii="Times New Roman" w:hAnsi="Times New Roman" w:cs="Times New Roman"/>
-        </w:rPr>
-      </w:pPr>
-      <w:r>
-        <w:rPr>
-          <w:rFonts w:ascii="Times New Roman" w:hAnsi="Times New Roman" w:cs="Times New Roman"/>
-        </w:rPr>
-        <w:t xml:space="preserve">    "</w:t>
-      </w:r>
-      <w:proofErr w:type="spellStart"/>
-      <w:proofErr w:type="gramStart"/>
-      <w:r>
-        <w:rPr>
-          <w:rFonts w:ascii="Times New Roman" w:hAnsi="Times New Roman" w:cs="Times New Roman"/>
-        </w:rPr>
-        <w:t>chronic</w:t>
-      </w:r>
-      <w:proofErr w:type="gramEnd"/>
-      <w:r>
-        <w:rPr>
-          <w:rFonts w:ascii="Times New Roman" w:hAnsi="Times New Roman" w:cs="Times New Roman"/>
-        </w:rPr>
-        <w:t>_epidermal_lesions</w:t>
-      </w:r>
-      <w:proofErr w:type="spellEnd"/>
-      <w:r>
-        <w:rPr>
-          <w:rFonts w:ascii="Times New Roman" w:hAnsi="Times New Roman" w:cs="Times New Roman"/>
-        </w:rPr>
-        <w:t>": "..."</w:t>
-      </w:r>
-    </w:p>
-    <w:p>
-      <w:pPr>
-        <w:rPr>
-          <w:rFonts w:ascii="Times New Roman" w:hAnsi="Times New Roman" w:cs="Times New Roman"/>
-        </w:rPr>
-      </w:pPr>
-      <w:r>
-        <w:rPr>
-          <w:rFonts w:ascii="Times New Roman" w:hAnsi="Times New Roman" w:cs="Times New Roman"/>
-        </w:rPr>
-        <w:t xml:space="preserve">  },</w:t>
-      </w:r>
-    </w:p>
-    <w:p>
-      <w:pPr>
-        <w:rPr>
-          <w:rFonts w:ascii="Times New Roman" w:hAnsi="Times New Roman" w:cs="Times New Roman"/>
-        </w:rPr>
-      </w:pPr>
-      <w:r>
-        <w:rPr>
-          <w:rFonts w:ascii="Times New Roman" w:hAnsi="Times New Roman" w:cs="Times New Roman"/>
-        </w:rPr>
-        <w:t xml:space="preserve">  "</w:t>
-      </w:r>
-      <w:proofErr w:type="spellStart"/>
-      <w:proofErr w:type="gramStart"/>
-      <w:r>
-        <w:rPr>
-          <w:rFonts w:ascii="Times New Roman" w:hAnsi="Times New Roman" w:cs="Times New Roman"/>
-        </w:rPr>
-        <w:t>other</w:t>
-      </w:r>
-      <w:proofErr w:type="gramEnd"/>
-      <w:r>
-        <w:rPr>
-          <w:rFonts w:ascii="Times New Roman" w:hAnsi="Times New Roman" w:cs="Times New Roman"/>
-        </w:rPr>
-        <w:t>_distinctive_markers</w:t>
-      </w:r>
-      <w:proofErr w:type="spellEnd"/>
-      <w:r>
-        <w:rPr>
-          <w:rFonts w:ascii="Times New Roman" w:hAnsi="Times New Roman" w:cs="Times New Roman"/>
-        </w:rPr>
-        <w:t>": "..."</w:t>
-      </w:r>
-    </w:p>
-    <w:p>
-      <w:pPr>
-        <w:pBdr>
-          <w:bottom w:val="single" w:sz="6" w:space="1" w:color="auto"/>
-        </w:pBdr>
-        <w:rPr>
-          <w:rFonts w:ascii="Times New Roman" w:hAnsi="Times New Roman" w:cs="Times New Roman"/>
-        </w:rPr>
-      </w:pPr>
-      <w:r>
-        <w:rPr>
-          <w:rFonts w:ascii="Times New Roman" w:hAnsi="Times New Roman" w:cs="Times New Roman"/>
-        </w:rPr>
-        <w:t>}</w:t>
-      </w:r>
-    </w:p>
-    <w:p>
-      <w:pPr>
         <w:rPr>
           <w:rFonts w:ascii="Times New Roman" w:hAnsi="Times New Roman" w:cs="Times New Roman"/>
           <w:b/>
@@ -1987,14 +367,6 @@
           <w:bCs/>
         </w:rPr>
         <w:t>Giraffa Visual Feature Ontology Tree</w:t>
-      </w:r>
-      <w:r>
-        <w:rPr>
-          <w:rFonts w:ascii="Times New Roman" w:hAnsi="Times New Roman" w:cs="Times New Roman"/>
-          <w:b/>
-          <w:bCs/>
-        </w:rPr>
-        <w:t xml:space="preserve"> - Theory</w:t>
       </w:r>
     </w:p>
     <w:p>
@@ -2152,6 +524,7 @@
           <w:b/>
           <w:bCs/>
         </w:rPr>
+        <w:lastRenderedPageBreak/>
         <w:t xml:space="preserve">2. </w:t>
       </w:r>
       <w:proofErr w:type="spellStart"/>
@@ -2189,7 +562,6 @@
           <w:b/>
           <w:bCs/>
         </w:rPr>
-        <w:lastRenderedPageBreak/>
         <w:t>Discriminative Rationale:</w:t>
       </w:r>
       <w:r>
@@ -2634,20 +1006,14 @@
           <w:b/>
           <w:bCs/>
         </w:rPr>
+        <w:lastRenderedPageBreak/>
         <w:t>Discriminative Rationale:</w:t>
       </w:r>
       <w:r>
         <w:rPr>
           <w:rFonts w:ascii="Times New Roman" w:hAnsi="Times New Roman" w:cs="Times New Roman"/>
         </w:rPr>
-        <w:t xml:space="preserve"> This category captures the accumulation of lifetime physical trauma, pathological conditions, and parasitic interactions. Because these are </w:t>
-      </w:r>
-      <w:r>
-        <w:rPr>
-          <w:rFonts w:ascii="Times New Roman" w:hAnsi="Times New Roman" w:cs="Times New Roman"/>
-        </w:rPr>
-        <w:lastRenderedPageBreak/>
-        <w:t xml:space="preserve">stochastic events, they provide exceptionally high confidence for long-tail, individual </w:t>
+        <w:t xml:space="preserve"> This category captures the accumulation of lifetime physical trauma, pathological conditions, and parasitic interactions. Because these are stochastic events, they provide exceptionally high confidence for long-tail, individual </w:t>
       </w:r>
       <w:proofErr w:type="spellStart"/>
       <w:r>
@@ -2788,60 +1154,359 @@
           <w:rFonts w:ascii="Times New Roman" w:hAnsi="Times New Roman" w:cs="Times New Roman"/>
         </w:rPr>
       </w:pPr>
-    </w:p>
-    <w:p>
-      <w:pPr>
-        <w:rPr>
-          <w:rFonts w:ascii="Times New Roman" w:hAnsi="Times New Roman" w:cs="Times New Roman"/>
-          <w:b/>
-          <w:bCs/>
-        </w:rPr>
-      </w:pPr>
-      <w:r>
-        <w:rPr>
-          <w:rFonts w:ascii="Times New Roman" w:hAnsi="Times New Roman" w:cs="Times New Roman"/>
-          <w:b/>
-          <w:bCs/>
-        </w:rPr>
-        <w:t>Giraffa Visual Feature Ontology Tree</w:t>
-      </w:r>
-      <w:r>
-        <w:rPr>
-          <w:rFonts w:ascii="Times New Roman" w:hAnsi="Times New Roman" w:cs="Times New Roman"/>
-          <w:b/>
-          <w:bCs/>
-        </w:rPr>
-        <w:t xml:space="preserve"> - </w:t>
-      </w:r>
-      <w:r>
-        <w:rPr>
-          <w:rFonts w:ascii="Times New Roman" w:hAnsi="Times New Roman" w:cs="Times New Roman" w:hint="eastAsia"/>
-          <w:b/>
-          <w:bCs/>
-        </w:rPr>
-        <w:t>Viable</w:t>
-      </w:r>
-    </w:p>
-    <w:p>
-      <w:pPr>
-        <w:rPr>
-          <w:rFonts w:ascii="Times New Roman" w:hAnsi="Times New Roman" w:cs="Times New Roman"/>
-        </w:rPr>
-      </w:pPr>
-      <w:r>
-        <w:rPr>
-          <w:rFonts w:ascii="Times New Roman" w:hAnsi="Times New Roman" w:cs="Times New Roman"/>
-          <w:b/>
-          <w:bCs/>
-        </w:rPr>
-        <w:t>1. Pelage Structural Matrix (Primary Modality)</w:t>
+      <w:r>
+        <w:rPr>
+          <w:rFonts w:ascii="Times New Roman" w:hAnsi="Times New Roman" w:cs="Times New Roman"/>
+          <w:b/>
+          <w:bCs/>
+        </w:rPr>
+        <w:t>Role &amp; Context:</w:t>
+      </w:r>
+    </w:p>
+    <w:p>
+      <w:pPr>
+        <w:rPr>
+          <w:rFonts w:ascii="Times New Roman" w:hAnsi="Times New Roman" w:cs="Times New Roman"/>
+        </w:rPr>
+      </w:pPr>
+      <w:r>
+        <w:rPr>
+          <w:rFonts w:ascii="Times New Roman" w:hAnsi="Times New Roman" w:cs="Times New Roman"/>
+        </w:rPr>
+        <w:t>You are a rigorous Computer Vision Data Engineer responsible for translating biological theories into actionable and robust image annotation standards for an Animal Re-Identification (</w:t>
+      </w:r>
+      <w:proofErr w:type="spellStart"/>
+      <w:r>
+        <w:rPr>
+          <w:rFonts w:ascii="Times New Roman" w:hAnsi="Times New Roman" w:cs="Times New Roman"/>
+        </w:rPr>
+        <w:t>ReID</w:t>
+      </w:r>
+      <w:proofErr w:type="spellEnd"/>
+      <w:r>
+        <w:rPr>
+          <w:rFonts w:ascii="Times New Roman" w:hAnsi="Times New Roman" w:cs="Times New Roman"/>
+        </w:rPr>
+        <w:t>) benchmark.</w:t>
+      </w:r>
+    </w:p>
+    <w:p>
+      <w:pPr>
+        <w:rPr>
+          <w:rFonts w:ascii="Times New Roman" w:hAnsi="Times New Roman" w:cs="Times New Roman"/>
+        </w:rPr>
+      </w:pPr>
+      <w:r>
+        <w:rPr>
+          <w:rFonts w:ascii="Times New Roman" w:hAnsi="Times New Roman" w:cs="Times New Roman"/>
+          <w:b/>
+          <w:bCs/>
+        </w:rPr>
+        <w:t>Background &amp; Input:</w:t>
+      </w:r>
+    </w:p>
+    <w:p>
+      <w:pPr>
+        <w:rPr>
+          <w:rFonts w:ascii="Times New Roman" w:hAnsi="Times New Roman" w:cs="Times New Roman"/>
+        </w:rPr>
+      </w:pPr>
+      <w:r>
+        <w:rPr>
+          <w:rFonts w:ascii="Times New Roman" w:hAnsi="Times New Roman" w:cs="Times New Roman"/>
+        </w:rPr>
+        <w:t>The attached images are samples from our real-world research dataset.</w:t>
+      </w:r>
+    </w:p>
+    <w:p>
+      <w:pPr>
+        <w:rPr>
+          <w:rFonts w:ascii="Times New Roman" w:hAnsi="Times New Roman" w:cs="Times New Roman"/>
+        </w:rPr>
+      </w:pPr>
+      <w:r>
+        <w:rPr>
+          <w:rFonts w:ascii="Times New Roman" w:hAnsi="Times New Roman" w:cs="Times New Roman"/>
+        </w:rPr>
+        <w:t xml:space="preserve">Below is our theoretical Ontology for </w:t>
+      </w:r>
+      <w:r>
+        <w:rPr>
+          <w:rFonts w:ascii="Times New Roman" w:hAnsi="Times New Roman" w:cs="Times New Roman"/>
+          <w:b/>
+          <w:bCs/>
+        </w:rPr>
+        <w:t>[Species Name]</w:t>
+      </w:r>
+      <w:r>
+        <w:rPr>
+          <w:rFonts w:ascii="Times New Roman" w:hAnsi="Times New Roman" w:cs="Times New Roman"/>
+        </w:rPr>
+        <w:t>:</w:t>
+      </w:r>
+    </w:p>
+    <w:p>
+      <w:pPr>
+        <w:rPr>
+          <w:rFonts w:ascii="Times New Roman" w:hAnsi="Times New Roman" w:cs="Times New Roman"/>
+        </w:rPr>
+      </w:pPr>
+      <w:r>
+        <w:rPr>
+          <w:rFonts w:ascii="Times New Roman" w:hAnsi="Times New Roman" w:cs="Times New Roman"/>
+        </w:rPr>
+        <w:t>&lt;</w:t>
+      </w:r>
+      <w:proofErr w:type="spellStart"/>
+      <w:r>
+        <w:rPr>
+          <w:rFonts w:ascii="Times New Roman" w:hAnsi="Times New Roman" w:cs="Times New Roman"/>
+        </w:rPr>
+        <w:t>theoretical_ontology</w:t>
+      </w:r>
+      <w:proofErr w:type="spellEnd"/>
+      <w:r>
+        <w:rPr>
+          <w:rFonts w:ascii="Times New Roman" w:hAnsi="Times New Roman" w:cs="Times New Roman"/>
+        </w:rPr>
+        <w:t>&gt;</w:t>
+      </w:r>
+    </w:p>
+    <w:p>
+      <w:pPr>
+        <w:rPr>
+          <w:rFonts w:ascii="Times New Roman" w:hAnsi="Times New Roman" w:cs="Times New Roman"/>
+        </w:rPr>
+      </w:pPr>
+      <w:r>
+        <w:rPr>
+          <w:rFonts w:ascii="Times New Roman" w:hAnsi="Times New Roman" w:cs="Times New Roman"/>
+          <w:b/>
+          <w:bCs/>
+        </w:rPr>
+        <w:t>[Insert Ontology Text Here]</w:t>
+      </w:r>
+    </w:p>
+    <w:p>
+      <w:pPr>
+        <w:rPr>
+          <w:rFonts w:ascii="Times New Roman" w:hAnsi="Times New Roman" w:cs="Times New Roman"/>
+        </w:rPr>
+      </w:pPr>
+      <w:r>
+        <w:rPr>
+          <w:rFonts w:ascii="Times New Roman" w:hAnsi="Times New Roman" w:cs="Times New Roman"/>
+        </w:rPr>
+        <w:t>&lt;/</w:t>
+      </w:r>
+      <w:proofErr w:type="spellStart"/>
+      <w:r>
+        <w:rPr>
+          <w:rFonts w:ascii="Times New Roman" w:hAnsi="Times New Roman" w:cs="Times New Roman"/>
+        </w:rPr>
+        <w:t>theoretical_ontology</w:t>
+      </w:r>
+      <w:proofErr w:type="spellEnd"/>
+      <w:r>
+        <w:rPr>
+          <w:rFonts w:ascii="Times New Roman" w:hAnsi="Times New Roman" w:cs="Times New Roman"/>
+        </w:rPr>
+        <w:t>&gt;</w:t>
+      </w:r>
+    </w:p>
+    <w:p>
+      <w:pPr>
+        <w:rPr>
+          <w:rFonts w:ascii="Times New Roman" w:hAnsi="Times New Roman" w:cs="Times New Roman"/>
+        </w:rPr>
+      </w:pPr>
+      <w:r>
+        <w:rPr>
+          <w:rFonts w:ascii="Times New Roman" w:hAnsi="Times New Roman" w:cs="Times New Roman"/>
+          <w:b/>
+          <w:bCs/>
+        </w:rPr>
+        <w:t>Your Task:</w:t>
+      </w:r>
+    </w:p>
+    <w:p>
+      <w:pPr>
+        <w:rPr>
+          <w:rFonts w:ascii="Times New Roman" w:hAnsi="Times New Roman" w:cs="Times New Roman"/>
+        </w:rPr>
+      </w:pPr>
+      <w:r>
+        <w:rPr>
+          <w:rFonts w:ascii="Times New Roman" w:hAnsi="Times New Roman" w:cs="Times New Roman"/>
+        </w:rPr>
+        <w:t>Please carefully observe these real-world sample images and cross-reference them against the feature categories in the theoretical ontology. Execute the following steps strictly in order:</w:t>
+      </w:r>
+    </w:p>
+    <w:p>
+      <w:pPr>
+        <w:rPr>
+          <w:rFonts w:ascii="Times New Roman" w:hAnsi="Times New Roman" w:cs="Times New Roman"/>
+        </w:rPr>
+      </w:pPr>
+      <w:r>
+        <w:rPr>
+          <w:rFonts w:ascii="Times New Roman" w:hAnsi="Times New Roman" w:cs="Times New Roman"/>
+          <w:b/>
+          <w:bCs/>
+        </w:rPr>
+        <w:t>0. Environmental &amp; Sensor Profiling:</w:t>
+      </w:r>
+    </w:p>
+    <w:p>
+      <w:pPr>
+        <w:rPr>
+          <w:rFonts w:ascii="Times New Roman" w:hAnsi="Times New Roman" w:cs="Times New Roman"/>
+        </w:rPr>
+      </w:pPr>
+      <w:r>
+        <w:rPr>
+          <w:rFonts w:ascii="Times New Roman" w:hAnsi="Times New Roman" w:cs="Times New Roman"/>
+        </w:rPr>
+        <w:t xml:space="preserve">Before evaluating the features, briefly </w:t>
+      </w:r>
+      <w:proofErr w:type="spellStart"/>
+      <w:r>
+        <w:rPr>
+          <w:rFonts w:ascii="Times New Roman" w:hAnsi="Times New Roman" w:cs="Times New Roman"/>
+        </w:rPr>
+        <w:t>analyze</w:t>
+      </w:r>
+      <w:proofErr w:type="spellEnd"/>
+      <w:r>
+        <w:rPr>
+          <w:rFonts w:ascii="Times New Roman" w:hAnsi="Times New Roman" w:cs="Times New Roman"/>
+        </w:rPr>
+        <w:t xml:space="preserve"> the attached images and list the primary physical constraints present (e.g., are they mostly infrared? Is there severe motion blur, foliage occlusion, or a strictly limited Field of View?).</w:t>
+      </w:r>
+    </w:p>
+    <w:p>
+      <w:pPr>
+        <w:rPr>
+          <w:rFonts w:ascii="Times New Roman" w:hAnsi="Times New Roman" w:cs="Times New Roman"/>
+        </w:rPr>
+      </w:pPr>
+      <w:r>
+        <w:rPr>
+          <w:rFonts w:ascii="Times New Roman" w:hAnsi="Times New Roman" w:cs="Times New Roman"/>
+          <w:b/>
+          <w:bCs/>
+        </w:rPr>
+        <w:t>1. Feasibility Filtering (Pruning):</w:t>
+      </w:r>
+    </w:p>
+    <w:p>
+      <w:pPr>
+        <w:rPr>
+          <w:rFonts w:ascii="Times New Roman" w:hAnsi="Times New Roman" w:cs="Times New Roman"/>
+        </w:rPr>
+      </w:pPr>
+      <w:r>
+        <w:rPr>
+          <w:rFonts w:ascii="Times New Roman" w:hAnsi="Times New Roman" w:cs="Times New Roman"/>
+        </w:rPr>
+        <w:lastRenderedPageBreak/>
+        <w:t>Based on your diagnosis in Step 0, which features (or specific morphological sub-dimensions) are generally blurry, consistently unobservable, or frequently missing? Please ruthlessly eliminate them from the ontology. Provide a brief justification for each removal.</w:t>
+      </w:r>
+    </w:p>
+    <w:p>
+      <w:pPr>
+        <w:rPr>
+          <w:rFonts w:ascii="Times New Roman" w:hAnsi="Times New Roman" w:cs="Times New Roman"/>
+        </w:rPr>
+      </w:pPr>
+      <w:r>
+        <w:rPr>
+          <w:rFonts w:ascii="Times New Roman" w:hAnsi="Times New Roman" w:cs="Times New Roman"/>
+          <w:b/>
+          <w:bCs/>
+        </w:rPr>
+        <w:t>2. Retention &amp; Refinement:</w:t>
+      </w:r>
+    </w:p>
+    <w:p>
+      <w:pPr>
+        <w:rPr>
+          <w:rFonts w:ascii="Times New Roman" w:hAnsi="Times New Roman" w:cs="Times New Roman"/>
+        </w:rPr>
+      </w:pPr>
+      <w:r>
+        <w:rPr>
+          <w:rFonts w:ascii="Times New Roman" w:hAnsi="Times New Roman" w:cs="Times New Roman"/>
+        </w:rPr>
+        <w:t>Which features remain exceptionally clear and highly discriminative across these specific images? Fine-tune the descriptions of these retained features to better align with the actual visual perspective of an AI model or a human annotator (e.g., adapting biological terms into pixel-level or structural visual cues).</w:t>
+      </w:r>
+    </w:p>
+    <w:p>
+      <w:pPr>
+        <w:rPr>
+          <w:rFonts w:ascii="Times New Roman" w:hAnsi="Times New Roman" w:cs="Times New Roman"/>
+        </w:rPr>
+      </w:pPr>
+      <w:r>
+        <w:rPr>
+          <w:rFonts w:ascii="Times New Roman" w:hAnsi="Times New Roman" w:cs="Times New Roman"/>
+          <w:b/>
+          <w:bCs/>
+        </w:rPr>
+        <w:t>3. Output the Viable Ontology ($D_{viable}$):</w:t>
+      </w:r>
+    </w:p>
+    <w:p>
+      <w:pPr>
+        <w:pBdr>
+          <w:bottom w:val="single" w:sz="6" w:space="1" w:color="auto"/>
+        </w:pBdr>
+        <w:rPr>
+          <w:rFonts w:ascii="Times New Roman" w:hAnsi="Times New Roman" w:cs="Times New Roman"/>
+        </w:rPr>
+      </w:pPr>
+      <w:r>
+        <w:rPr>
+          <w:rFonts w:ascii="Times New Roman" w:hAnsi="Times New Roman" w:cs="Times New Roman"/>
+        </w:rPr>
+        <w:t>Output the final, refined, and pruned feature list that is strictly grounded in the visual reality of the provided dataset. Present this final ontology clearly using a structured Markdown format, categorizing the retained features and their new pixel-level definitions. Do not include any conversational filler after the final ontology.</w:t>
+      </w:r>
+    </w:p>
+    <w:p>
+      <w:pPr>
+        <w:rPr>
+          <w:rFonts w:ascii="Times New Roman" w:hAnsi="Times New Roman" w:cs="Times New Roman"/>
+          <w:b/>
+          <w:bCs/>
+        </w:rPr>
+      </w:pPr>
+      <w:r>
+        <w:rPr>
+          <w:rFonts w:ascii="Times New Roman" w:hAnsi="Times New Roman" w:cs="Times New Roman"/>
+          <w:b/>
+          <w:bCs/>
+        </w:rPr>
+        <w:t>Step 0: Environmental &amp; Sensor Profiling</w:t>
+      </w:r>
+    </w:p>
+    <w:p>
+      <w:pPr>
+        <w:rPr>
+          <w:rFonts w:ascii="Times New Roman" w:hAnsi="Times New Roman" w:cs="Times New Roman"/>
+        </w:rPr>
+      </w:pPr>
+      <w:r>
+        <w:rPr>
+          <w:rFonts w:ascii="Times New Roman" w:hAnsi="Times New Roman" w:cs="Times New Roman"/>
+        </w:rPr>
+        <w:t>An analysis of the provided image samples reveals the following definitive constraints:</w:t>
       </w:r>
     </w:p>
     <w:p>
       <w:pPr>
         <w:numPr>
           <w:ilvl w:val="0"/>
-          <w:numId w:val="14"/>
+          <w:numId w:val="17"/>
         </w:numPr>
         <w:rPr>
           <w:rFonts w:ascii="Times New Roman" w:hAnsi="Times New Roman" w:cs="Times New Roman"/>
@@ -2853,20 +1518,38 @@
           <w:b/>
           <w:bCs/>
         </w:rPr>
-        <w:t>Polygon Edge Morphology:</w:t>
-      </w:r>
-      <w:r>
-        <w:rPr>
-          <w:rFonts w:ascii="Times New Roman" w:hAnsi="Times New Roman" w:cs="Times New Roman"/>
-        </w:rPr>
-        <w:t xml:space="preserve"> Classification of the bounding edges of the individual dark patches (e.g., high-frequency jagged edges vs. low-frequency smooth, lobed edges).</w:t>
+        <w:t>Strictly Bounded Field of View (</w:t>
+      </w:r>
+      <w:proofErr w:type="spellStart"/>
+      <w:r>
+        <w:rPr>
+          <w:rFonts w:ascii="Times New Roman" w:hAnsi="Times New Roman" w:cs="Times New Roman"/>
+          <w:b/>
+          <w:bCs/>
+        </w:rPr>
+        <w:t>FoV</w:t>
+      </w:r>
+      <w:proofErr w:type="spellEnd"/>
+      <w:r>
+        <w:rPr>
+          <w:rFonts w:ascii="Times New Roman" w:hAnsi="Times New Roman" w:cs="Times New Roman"/>
+          <w:b/>
+          <w:bCs/>
+        </w:rPr>
+        <w:t>):</w:t>
+      </w:r>
+      <w:r>
+        <w:rPr>
+          <w:rFonts w:ascii="Times New Roman" w:hAnsi="Times New Roman" w:cs="Times New Roman"/>
+        </w:rPr>
+        <w:t xml:space="preserve"> Every sample is tightly framed on the torso, flank, shoulder, and lower-to-mid dorsal neck. Cranial structures (heads), distal limbs (lower legs), and caudal extremities (tails) are uniformly excluded from the sensor's perspective.</w:t>
       </w:r>
     </w:p>
     <w:p>
       <w:pPr>
         <w:numPr>
           <w:ilvl w:val="0"/>
-          <w:numId w:val="14"/>
+          <w:numId w:val="17"/>
         </w:numPr>
         <w:rPr>
           <w:rFonts w:ascii="Times New Roman" w:hAnsi="Times New Roman" w:cs="Times New Roman"/>
@@ -2878,20 +1561,20 @@
           <w:b/>
           <w:bCs/>
         </w:rPr>
-        <w:t>Corridor Topology:</w:t>
-      </w:r>
-      <w:r>
-        <w:rPr>
-          <w:rFonts w:ascii="Times New Roman" w:hAnsi="Times New Roman" w:cs="Times New Roman"/>
-        </w:rPr>
-        <w:t xml:space="preserve"> The geometric continuity, relative pixel width, and intersection angles of the light connective tissue separating the primary patches.</w:t>
+        <w:t>Biological Occlusions:</w:t>
+      </w:r>
+      <w:r>
+        <w:rPr>
+          <w:rFonts w:ascii="Times New Roman" w:hAnsi="Times New Roman" w:cs="Times New Roman"/>
+        </w:rPr>
+        <w:t xml:space="preserve"> There is a frequent presence of avian interactors (oxpeckers) along the dorsal ridge (e.g., Images 0, 3, 6, 8). These act as dynamic occlusions but also serve as markers for localized dermal alterations.</w:t>
       </w:r>
     </w:p>
     <w:p>
       <w:pPr>
         <w:numPr>
           <w:ilvl w:val="0"/>
-          <w:numId w:val="14"/>
+          <w:numId w:val="17"/>
         </w:numPr>
         <w:rPr>
           <w:rFonts w:ascii="Times New Roman" w:hAnsi="Times New Roman" w:cs="Times New Roman"/>
@@ -2903,60 +1586,113 @@
           <w:b/>
           <w:bCs/>
         </w:rPr>
-        <w:t>Relative Intensity Gradient:</w:t>
-      </w:r>
-      <w:r>
-        <w:rPr>
-          <w:rFonts w:ascii="Times New Roman" w:hAnsi="Times New Roman" w:cs="Times New Roman"/>
-        </w:rPr>
-        <w:t xml:space="preserve"> The measurable pixel intensity difference calculated locally between the centroid of a dark patch and its bounding light corridor (to normalize for global lighting variance).</w:t>
-      </w:r>
-    </w:p>
-    <w:p>
-      <w:pPr>
-        <w:rPr>
-          <w:rFonts w:ascii="Times New Roman" w:hAnsi="Times New Roman" w:cs="Times New Roman"/>
-        </w:rPr>
-      </w:pPr>
-      <w:r>
-        <w:rPr>
-          <w:rFonts w:ascii="Times New Roman" w:hAnsi="Times New Roman" w:cs="Times New Roman"/>
-          <w:b/>
-          <w:bCs/>
-        </w:rPr>
-        <w:t>2. Surface-Level Topographical Anomalies (Secondary Modality)</w:t>
+        <w:t>Variable Contrast:</w:t>
+      </w:r>
+      <w:r>
+        <w:rPr>
+          <w:rFonts w:ascii="Times New Roman" w:hAnsi="Times New Roman" w:cs="Times New Roman"/>
+        </w:rPr>
+        <w:t xml:space="preserve"> Illumination and exposure vary, causing significant fluctuations in the apparent relative albedo between the dark pelage patches and the light connective corridors. Some coats appear highly faded or washed out due to sensor exposure.</w:t>
+      </w:r>
+    </w:p>
+    <w:p>
+      <w:pPr>
+        <w:rPr>
+          <w:rFonts w:ascii="Times New Roman" w:hAnsi="Times New Roman" w:cs="Times New Roman"/>
+          <w:b/>
+          <w:bCs/>
+        </w:rPr>
+      </w:pPr>
+      <w:r>
+        <w:rPr>
+          <w:rFonts w:ascii="Times New Roman" w:hAnsi="Times New Roman" w:cs="Times New Roman"/>
+          <w:b/>
+          <w:bCs/>
+        </w:rPr>
+        <w:t>Step 1: Feasibility Filtering (Pruning)</w:t>
+      </w:r>
+    </w:p>
+    <w:p>
+      <w:pPr>
+        <w:rPr>
+          <w:rFonts w:ascii="Times New Roman" w:hAnsi="Times New Roman" w:cs="Times New Roman"/>
+        </w:rPr>
+      </w:pPr>
+      <w:r>
+        <w:rPr>
+          <w:rFonts w:ascii="Times New Roman" w:hAnsi="Times New Roman" w:cs="Times New Roman"/>
+        </w:rPr>
+        <w:t xml:space="preserve">Deriving directly from the environmental profiling, the following biological features are systematically unobservable and must be </w:t>
+      </w:r>
+      <w:proofErr w:type="gramStart"/>
+      <w:r>
+        <w:rPr>
+          <w:rFonts w:ascii="Times New Roman" w:hAnsi="Times New Roman" w:cs="Times New Roman"/>
+        </w:rPr>
+        <w:t>completely eliminated</w:t>
+      </w:r>
+      <w:proofErr w:type="gramEnd"/>
+      <w:r>
+        <w:rPr>
+          <w:rFonts w:ascii="Times New Roman" w:hAnsi="Times New Roman" w:cs="Times New Roman"/>
+        </w:rPr>
+        <w:t xml:space="preserve"> from the annotation pipeline to prevent high instances of missing data and model hallucination:</w:t>
       </w:r>
     </w:p>
     <w:p>
       <w:pPr>
         <w:numPr>
           <w:ilvl w:val="0"/>
-          <w:numId w:val="15"/>
+          <w:numId w:val="18"/>
         </w:numPr>
         <w:rPr>
           <w:rFonts w:ascii="Times New Roman" w:hAnsi="Times New Roman" w:cs="Times New Roman"/>
         </w:rPr>
       </w:pPr>
-      <w:r>
-        <w:rPr>
-          <w:rFonts w:ascii="Times New Roman" w:hAnsi="Times New Roman" w:cs="Times New Roman"/>
-          <w:b/>
-          <w:bCs/>
-        </w:rPr>
-        <w:t>Symbiotic/Parasitic Occlusion:</w:t>
-      </w:r>
-      <w:r>
-        <w:rPr>
-          <w:rFonts w:ascii="Times New Roman" w:hAnsi="Times New Roman" w:cs="Times New Roman"/>
-        </w:rPr>
-        <w:t xml:space="preserve"> Detection of oxpeckers or similar fauna adhering to the flank, acting as temporal identifying markers.</w:t>
+      <w:proofErr w:type="spellStart"/>
+      <w:r>
+        <w:rPr>
+          <w:rFonts w:ascii="Times New Roman" w:hAnsi="Times New Roman" w:cs="Times New Roman"/>
+          <w:b/>
+          <w:bCs/>
+        </w:rPr>
+        <w:t>Ossicone</w:t>
+      </w:r>
+      <w:proofErr w:type="spellEnd"/>
+      <w:r>
+        <w:rPr>
+          <w:rFonts w:ascii="Times New Roman" w:hAnsi="Times New Roman" w:cs="Times New Roman"/>
+          <w:b/>
+          <w:bCs/>
+        </w:rPr>
+        <w:t xml:space="preserve"> Morphology:</w:t>
+      </w:r>
+      <w:r>
+        <w:rPr>
+          <w:rFonts w:ascii="Times New Roman" w:hAnsi="Times New Roman" w:cs="Times New Roman"/>
+        </w:rPr>
+        <w:t xml:space="preserve"> Pruned. The cranial vault is outside the dataset's </w:t>
+      </w:r>
+      <w:proofErr w:type="spellStart"/>
+      <w:r>
+        <w:rPr>
+          <w:rFonts w:ascii="Times New Roman" w:hAnsi="Times New Roman" w:cs="Times New Roman"/>
+        </w:rPr>
+        <w:t>FoV</w:t>
+      </w:r>
+      <w:proofErr w:type="spellEnd"/>
+      <w:r>
+        <w:rPr>
+          <w:rFonts w:ascii="Times New Roman" w:hAnsi="Times New Roman" w:cs="Times New Roman"/>
+        </w:rPr>
+        <w:t>; structural angles and apex profiles cannot be captured.</w:t>
       </w:r>
     </w:p>
     <w:p>
       <w:pPr>
         <w:numPr>
           <w:ilvl w:val="0"/>
-          <w:numId w:val="15"/>
+          <w:numId w:val="18"/>
         </w:numPr>
         <w:rPr>
           <w:rFonts w:ascii="Times New Roman" w:hAnsi="Times New Roman" w:cs="Times New Roman"/>
@@ -2968,13 +1704,976 @@
           <w:b/>
           <w:bCs/>
         </w:rPr>
-        <w:t>Chronic Epidermal Lesions:</w:t>
-      </w:r>
-      <w:r>
-        <w:rPr>
-          <w:rFonts w:ascii="Times New Roman" w:hAnsi="Times New Roman" w:cs="Times New Roman"/>
-        </w:rPr>
-        <w:t xml:space="preserve"> Identification of static, localized disruptions in the pelage pattern, manifesting as hyper-pigmented spots, visible scarring, or depressed topographical nodes (commonly resulting from continuous oxpecker feeding at tick sites).</w:t>
+        <w:t>Ear Margins:</w:t>
+      </w:r>
+      <w:r>
+        <w:rPr>
+          <w:rFonts w:ascii="Times New Roman" w:hAnsi="Times New Roman" w:cs="Times New Roman"/>
+        </w:rPr>
+        <w:t xml:space="preserve"> Pruned. Pinnae are entirely unobservable.</w:t>
+      </w:r>
+    </w:p>
+    <w:p>
+      <w:pPr>
+        <w:numPr>
+          <w:ilvl w:val="0"/>
+          <w:numId w:val="18"/>
+        </w:numPr>
+        <w:rPr>
+          <w:rFonts w:ascii="Times New Roman" w:hAnsi="Times New Roman" w:cs="Times New Roman"/>
+        </w:rPr>
+      </w:pPr>
+      <w:r>
+        <w:rPr>
+          <w:rFonts w:ascii="Times New Roman" w:hAnsi="Times New Roman" w:cs="Times New Roman"/>
+          <w:b/>
+          <w:bCs/>
+        </w:rPr>
+        <w:t>Acquired Traits (Appendage Anomalies):</w:t>
+      </w:r>
+      <w:r>
+        <w:rPr>
+          <w:rFonts w:ascii="Times New Roman" w:hAnsi="Times New Roman" w:cs="Times New Roman"/>
+        </w:rPr>
+        <w:t xml:space="preserve"> Pruned. Features such as amputated tails, lower limb wire snares, and localized limb indentations are out of frame and cannot be evaluated.</w:t>
+      </w:r>
+    </w:p>
+    <w:p>
+      <w:pPr>
+        <w:rPr>
+          <w:rFonts w:ascii="Times New Roman" w:hAnsi="Times New Roman" w:cs="Times New Roman"/>
+          <w:b/>
+          <w:bCs/>
+        </w:rPr>
+      </w:pPr>
+      <w:r>
+        <w:rPr>
+          <w:rFonts w:ascii="Times New Roman" w:hAnsi="Times New Roman" w:cs="Times New Roman"/>
+          <w:b/>
+          <w:bCs/>
+        </w:rPr>
+        <w:lastRenderedPageBreak/>
+        <w:t>Step 2: Retention &amp; Refinement</w:t>
+      </w:r>
+    </w:p>
+    <w:p>
+      <w:pPr>
+        <w:rPr>
+          <w:rFonts w:ascii="Times New Roman" w:hAnsi="Times New Roman" w:cs="Times New Roman"/>
+        </w:rPr>
+      </w:pPr>
+      <w:r>
+        <w:rPr>
+          <w:rFonts w:ascii="Times New Roman" w:hAnsi="Times New Roman" w:cs="Times New Roman"/>
+        </w:rPr>
+        <w:t>The features that survive the pruning process must be translated from theoretical biological concepts into actionable, pixel-level visual cues suitable for annotators and convolutional architectures.</w:t>
+      </w:r>
+    </w:p>
+    <w:p>
+      <w:pPr>
+        <w:numPr>
+          <w:ilvl w:val="0"/>
+          <w:numId w:val="19"/>
+        </w:numPr>
+        <w:rPr>
+          <w:rFonts w:ascii="Times New Roman" w:hAnsi="Times New Roman" w:cs="Times New Roman"/>
+        </w:rPr>
+      </w:pPr>
+      <w:r>
+        <w:rPr>
+          <w:rFonts w:ascii="Times New Roman" w:hAnsi="Times New Roman" w:cs="Times New Roman"/>
+          <w:b/>
+          <w:bCs/>
+        </w:rPr>
+        <w:t>Pelage Network (Flank and Neck):</w:t>
+      </w:r>
+      <w:r>
+        <w:rPr>
+          <w:rFonts w:ascii="Times New Roman" w:hAnsi="Times New Roman" w:cs="Times New Roman"/>
+        </w:rPr>
+        <w:t xml:space="preserve"> Retained as the primary biological barcode. This must be refined from "geometric complexity" to specific computer vision tasks: instance segmentation of dark contiguous blobs (measuring polygon area, perimeter, and angularity) and the extraction of the negative-space topological graph (measuring pixel width and junction nodes of the light connective corridors).</w:t>
+      </w:r>
+    </w:p>
+    <w:p>
+      <w:pPr>
+        <w:numPr>
+          <w:ilvl w:val="0"/>
+          <w:numId w:val="19"/>
+        </w:numPr>
+        <w:rPr>
+          <w:rFonts w:ascii="Times New Roman" w:hAnsi="Times New Roman" w:cs="Times New Roman"/>
+        </w:rPr>
+      </w:pPr>
+      <w:r>
+        <w:rPr>
+          <w:rFonts w:ascii="Times New Roman" w:hAnsi="Times New Roman" w:cs="Times New Roman"/>
+          <w:b/>
+          <w:bCs/>
+        </w:rPr>
+        <w:t>Mane Contour:</w:t>
+      </w:r>
+      <w:r>
+        <w:rPr>
+          <w:rFonts w:ascii="Times New Roman" w:hAnsi="Times New Roman" w:cs="Times New Roman"/>
+        </w:rPr>
+        <w:t xml:space="preserve"> Retained as a secondary structural silhouette. Refined from "hair growth" to a 1D structural edge-detection profile. Annotators will track the dorsal ridge line to quantify serration amplitude (pixel variance from a smooth curve) and detect structural gaps (sudden discontinuities in the ridge edge).</w:t>
+      </w:r>
+    </w:p>
+    <w:p>
+      <w:pPr>
+        <w:numPr>
+          <w:ilvl w:val="0"/>
+          <w:numId w:val="19"/>
+        </w:numPr>
+        <w:rPr>
+          <w:rFonts w:ascii="Times New Roman" w:hAnsi="Times New Roman" w:cs="Times New Roman"/>
+        </w:rPr>
+      </w:pPr>
+      <w:r>
+        <w:rPr>
+          <w:rFonts w:ascii="Times New Roman" w:hAnsi="Times New Roman" w:cs="Times New Roman"/>
+          <w:b/>
+          <w:bCs/>
+        </w:rPr>
+        <w:t>Acquired Traits (Dorsal Lesions):</w:t>
+      </w:r>
+      <w:r>
+        <w:rPr>
+          <w:rFonts w:ascii="Times New Roman" w:hAnsi="Times New Roman" w:cs="Times New Roman"/>
+        </w:rPr>
+        <w:t xml:space="preserve"> Retained as a stochastic, high-confidence identifier. Refined to the detection of localized, static texture anomalies. This targets areas of focal depigmentation or hypertrophic scarring on the upper back/flank, specifically focusing on regions frequently inhabited by oxpeckers.</w:t>
+      </w:r>
+    </w:p>
+    <w:p>
+      <w:pPr>
+        <w:rPr>
+          <w:rFonts w:ascii="Times New Roman" w:hAnsi="Times New Roman" w:cs="Times New Roman"/>
+        </w:rPr>
+      </w:pPr>
+      <w:r>
+        <w:rPr>
+          <w:rFonts w:ascii="Times New Roman" w:hAnsi="Times New Roman" w:cs="Times New Roman"/>
+        </w:rPr>
+        <w:t xml:space="preserve">Would you like me to draft the exact segmentation and bounding-box annotation protocols for these remaining </w:t>
+      </w:r>
+      <w:proofErr w:type="gramStart"/>
+      <w:r>
+        <w:rPr>
+          <w:rFonts w:ascii="Times New Roman" w:hAnsi="Times New Roman" w:cs="Times New Roman"/>
+        </w:rPr>
+        <w:t>features</w:t>
+      </w:r>
+      <w:proofErr w:type="gramEnd"/>
+      <w:r>
+        <w:rPr>
+          <w:rFonts w:ascii="Times New Roman" w:hAnsi="Times New Roman" w:cs="Times New Roman"/>
+        </w:rPr>
+        <w:t xml:space="preserve"> so your </w:t>
+      </w:r>
+      <w:proofErr w:type="spellStart"/>
+      <w:r>
+        <w:rPr>
+          <w:rFonts w:ascii="Times New Roman" w:hAnsi="Times New Roman" w:cs="Times New Roman"/>
+        </w:rPr>
+        <w:t>labeling</w:t>
+      </w:r>
+      <w:proofErr w:type="spellEnd"/>
+      <w:r>
+        <w:rPr>
+          <w:rFonts w:ascii="Times New Roman" w:hAnsi="Times New Roman" w:cs="Times New Roman"/>
+        </w:rPr>
+        <w:t xml:space="preserve"> team has clear spatial instructions?</w:t>
+      </w:r>
+    </w:p>
+    <w:p>
+      <w:pPr>
+        <w:rPr>
+          <w:rFonts w:ascii="Times New Roman" w:hAnsi="Times New Roman" w:cs="Times New Roman"/>
+          <w:b/>
+          <w:bCs/>
+        </w:rPr>
+      </w:pPr>
+      <w:r>
+        <w:rPr>
+          <w:rFonts w:ascii="Times New Roman" w:hAnsi="Times New Roman" w:cs="Times New Roman"/>
+          <w:b/>
+          <w:bCs/>
+        </w:rPr>
+        <w:t>Step 3: Viable Ontology ($D_{viable}$)</w:t>
+      </w:r>
+    </w:p>
+    <w:p>
+      <w:pPr>
+        <w:rPr>
+          <w:rFonts w:ascii="Times New Roman" w:hAnsi="Times New Roman" w:cs="Times New Roman"/>
+        </w:rPr>
+      </w:pPr>
+      <w:r>
+        <w:rPr>
+          <w:rFonts w:ascii="Times New Roman" w:hAnsi="Times New Roman" w:cs="Times New Roman"/>
+          <w:b/>
+          <w:bCs/>
+        </w:rPr>
+        <w:t>1. Pelage Geometry and Topology</w:t>
+      </w:r>
+    </w:p>
+    <w:p>
+      <w:pPr>
+        <w:numPr>
+          <w:ilvl w:val="0"/>
+          <w:numId w:val="20"/>
+        </w:numPr>
+        <w:rPr>
+          <w:rFonts w:ascii="Times New Roman" w:hAnsi="Times New Roman" w:cs="Times New Roman"/>
+        </w:rPr>
+      </w:pPr>
+      <w:r>
+        <w:rPr>
+          <w:rFonts w:ascii="Times New Roman" w:hAnsi="Times New Roman" w:cs="Times New Roman"/>
+          <w:b/>
+          <w:bCs/>
+        </w:rPr>
+        <w:t>Patch Morphology:</w:t>
+      </w:r>
+      <w:r>
+        <w:rPr>
+          <w:rFonts w:ascii="Times New Roman" w:hAnsi="Times New Roman" w:cs="Times New Roman"/>
+        </w:rPr>
+        <w:t xml:space="preserve"> The pixel-level geometry of individual dark contiguous regions on the flank and lower neck. Evaluated via polygon boundaries, focusing on edge angularity (sharp vs. smooth pixel gradients) and spatial area.</w:t>
+      </w:r>
+    </w:p>
+    <w:p>
+      <w:pPr>
+        <w:numPr>
+          <w:ilvl w:val="0"/>
+          <w:numId w:val="20"/>
+        </w:numPr>
+        <w:rPr>
+          <w:rFonts w:ascii="Times New Roman" w:hAnsi="Times New Roman" w:cs="Times New Roman"/>
+        </w:rPr>
+      </w:pPr>
+      <w:r>
+        <w:rPr>
+          <w:rFonts w:ascii="Times New Roman" w:hAnsi="Times New Roman" w:cs="Times New Roman"/>
+          <w:b/>
+          <w:bCs/>
+        </w:rPr>
+        <w:t>Corridor Network:</w:t>
+      </w:r>
+      <w:r>
+        <w:rPr>
+          <w:rFonts w:ascii="Times New Roman" w:hAnsi="Times New Roman" w:cs="Times New Roman"/>
+        </w:rPr>
+        <w:t xml:space="preserve"> The negative-space topological graph formed by the light pelage separating the patches. Evaluated by mapping junction nodes (intersections of lines) and measuring the pixel thickness and continuity of these pathways.</w:t>
+      </w:r>
+    </w:p>
+    <w:p>
+      <w:pPr>
+        <w:rPr>
+          <w:rFonts w:ascii="Times New Roman" w:hAnsi="Times New Roman" w:cs="Times New Roman"/>
+        </w:rPr>
+      </w:pPr>
+      <w:r>
+        <w:rPr>
+          <w:rFonts w:ascii="Times New Roman" w:hAnsi="Times New Roman" w:cs="Times New Roman"/>
+          <w:b/>
+          <w:bCs/>
+        </w:rPr>
+        <w:t>2. Dorsal Ridge Profile</w:t>
+      </w:r>
+    </w:p>
+    <w:p>
+      <w:pPr>
+        <w:numPr>
+          <w:ilvl w:val="0"/>
+          <w:numId w:val="21"/>
+        </w:numPr>
+        <w:rPr>
+          <w:rFonts w:ascii="Times New Roman" w:hAnsi="Times New Roman" w:cs="Times New Roman"/>
+        </w:rPr>
+      </w:pPr>
+      <w:r>
+        <w:rPr>
+          <w:rFonts w:ascii="Times New Roman" w:hAnsi="Times New Roman" w:cs="Times New Roman"/>
+          <w:b/>
+          <w:bCs/>
+        </w:rPr>
+        <w:t>Edge Serration:</w:t>
+      </w:r>
+      <w:r>
+        <w:rPr>
+          <w:rFonts w:ascii="Times New Roman" w:hAnsi="Times New Roman" w:cs="Times New Roman"/>
+        </w:rPr>
+        <w:t xml:space="preserve"> The 1D geometric contour of the mane along the upper neck and shoulder. Evaluated by tracking the amplitude and frequency of the jagged silhouette against the background.</w:t>
+      </w:r>
+    </w:p>
+    <w:p>
+      <w:pPr>
+        <w:numPr>
+          <w:ilvl w:val="0"/>
+          <w:numId w:val="21"/>
+        </w:numPr>
+        <w:rPr>
+          <w:rFonts w:ascii="Times New Roman" w:hAnsi="Times New Roman" w:cs="Times New Roman"/>
+        </w:rPr>
+      </w:pPr>
+      <w:r>
+        <w:rPr>
+          <w:rFonts w:ascii="Times New Roman" w:hAnsi="Times New Roman" w:cs="Times New Roman"/>
+          <w:b/>
+          <w:bCs/>
+        </w:rPr>
+        <w:t>Contour Gaps:</w:t>
+      </w:r>
+      <w:r>
+        <w:rPr>
+          <w:rFonts w:ascii="Times New Roman" w:hAnsi="Times New Roman" w:cs="Times New Roman"/>
+        </w:rPr>
+        <w:t xml:space="preserve"> Isolated, abrupt discontinuities or structural breaks within the otherwise continuous mane line.</w:t>
+      </w:r>
+    </w:p>
+    <w:p>
+      <w:pPr>
+        <w:rPr>
+          <w:rFonts w:ascii="Times New Roman" w:hAnsi="Times New Roman" w:cs="Times New Roman"/>
+        </w:rPr>
+      </w:pPr>
+      <w:r>
+        <w:rPr>
+          <w:rFonts w:ascii="Times New Roman" w:hAnsi="Times New Roman" w:cs="Times New Roman"/>
+          <w:b/>
+          <w:bCs/>
+        </w:rPr>
+        <w:t>3. Focal Dorsal Anomalies</w:t>
+      </w:r>
+    </w:p>
+    <w:p>
+      <w:pPr>
+        <w:numPr>
+          <w:ilvl w:val="0"/>
+          <w:numId w:val="22"/>
+        </w:numPr>
+        <w:rPr>
+          <w:rFonts w:ascii="Times New Roman" w:hAnsi="Times New Roman" w:cs="Times New Roman"/>
+        </w:rPr>
+      </w:pPr>
+      <w:r>
+        <w:rPr>
+          <w:rFonts w:ascii="Times New Roman" w:hAnsi="Times New Roman" w:cs="Times New Roman"/>
+          <w:b/>
+          <w:bCs/>
+        </w:rPr>
+        <w:t>Chronic Feeding Lesions:</w:t>
+      </w:r>
+      <w:r>
+        <w:rPr>
+          <w:rFonts w:ascii="Times New Roman" w:hAnsi="Times New Roman" w:cs="Times New Roman"/>
+        </w:rPr>
+        <w:t xml:space="preserve"> Localized patches of textural disruption, hyper-pigmentation, or de-pigmentation on the upper flank and dorsal ridge. These static </w:t>
+      </w:r>
+      <w:r>
+        <w:rPr>
+          <w:rFonts w:ascii="Times New Roman" w:hAnsi="Times New Roman" w:cs="Times New Roman"/>
+        </w:rPr>
+        <w:lastRenderedPageBreak/>
+        <w:t>markers correlate with the frequent physical presence of oxpeckers and provide stochastic verification points independent of the primary pelage grid.</w:t>
+      </w:r>
+    </w:p>
+    <w:p>
+      <w:pPr>
+        <w:pBdr>
+          <w:bottom w:val="single" w:sz="6" w:space="1" w:color="auto"/>
+        </w:pBdr>
+        <w:rPr>
+          <w:rFonts w:ascii="Times New Roman" w:hAnsi="Times New Roman" w:cs="Times New Roman"/>
+        </w:rPr>
+      </w:pPr>
+    </w:p>
+    <w:p>
+      <w:pPr>
+        <w:rPr>
+          <w:rFonts w:ascii="Times New Roman" w:hAnsi="Times New Roman" w:cs="Times New Roman"/>
+        </w:rPr>
+      </w:pPr>
+      <w:r>
+        <w:rPr>
+          <w:rFonts w:ascii="Times New Roman" w:hAnsi="Times New Roman" w:cs="Times New Roman"/>
+          <w:b/>
+          <w:bCs/>
+        </w:rPr>
+        <w:t>Role &amp; Context:</w:t>
+      </w:r>
+    </w:p>
+    <w:p>
+      <w:pPr>
+        <w:rPr>
+          <w:rFonts w:ascii="Times New Roman" w:hAnsi="Times New Roman" w:cs="Times New Roman"/>
+        </w:rPr>
+      </w:pPr>
+      <w:r>
+        <w:rPr>
+          <w:rFonts w:ascii="Times New Roman" w:hAnsi="Times New Roman" w:cs="Times New Roman"/>
+        </w:rPr>
+        <w:t>You are an expert AI Prompt Engineer and Computer Vision Dataset Architect.</w:t>
+      </w:r>
+    </w:p>
+    <w:p>
+      <w:pPr>
+        <w:rPr>
+          <w:rFonts w:ascii="Times New Roman" w:hAnsi="Times New Roman" w:cs="Times New Roman"/>
+        </w:rPr>
+      </w:pPr>
+      <w:r>
+        <w:rPr>
+          <w:rFonts w:ascii="Times New Roman" w:hAnsi="Times New Roman" w:cs="Times New Roman"/>
+          <w:b/>
+          <w:bCs/>
+        </w:rPr>
+        <w:t>Your Task:</w:t>
+      </w:r>
+    </w:p>
+    <w:p>
+      <w:pPr>
+        <w:rPr>
+          <w:rFonts w:ascii="Times New Roman" w:hAnsi="Times New Roman" w:cs="Times New Roman"/>
+        </w:rPr>
+      </w:pPr>
+      <w:r>
+        <w:rPr>
+          <w:rFonts w:ascii="Times New Roman" w:hAnsi="Times New Roman" w:cs="Times New Roman"/>
+        </w:rPr>
+        <w:t xml:space="preserve">I will provide you with a "Viable Ontology" ($D_{viable}$) for a specific animal species: </w:t>
+      </w:r>
+      <w:r>
+        <w:rPr>
+          <w:rFonts w:ascii="Times New Roman" w:hAnsi="Times New Roman" w:cs="Times New Roman"/>
+          <w:b/>
+          <w:bCs/>
+        </w:rPr>
+        <w:t>[</w:t>
+      </w:r>
+      <w:r>
+        <w:rPr>
+          <w:rFonts w:ascii="Times New Roman" w:hAnsi="Times New Roman" w:cs="Times New Roman" w:hint="eastAsia"/>
+          <w:b/>
+          <w:bCs/>
+        </w:rPr>
+        <w:t>Species Name</w:t>
+      </w:r>
+      <w:r>
+        <w:rPr>
+          <w:rFonts w:ascii="Times New Roman" w:hAnsi="Times New Roman" w:cs="Times New Roman"/>
+          <w:b/>
+          <w:bCs/>
+        </w:rPr>
+        <w:t>]</w:t>
+      </w:r>
+      <w:r>
+        <w:rPr>
+          <w:rFonts w:ascii="Times New Roman" w:hAnsi="Times New Roman" w:cs="Times New Roman"/>
+        </w:rPr>
+        <w:t>.</w:t>
+      </w:r>
+    </w:p>
+    <w:p>
+      <w:pPr>
+        <w:rPr>
+          <w:rFonts w:ascii="Times New Roman" w:hAnsi="Times New Roman" w:cs="Times New Roman"/>
+        </w:rPr>
+      </w:pPr>
+      <w:r>
+        <w:rPr>
+          <w:rFonts w:ascii="Times New Roman" w:hAnsi="Times New Roman" w:cs="Times New Roman"/>
+        </w:rPr>
+        <w:t>Your job is to automatically generate a highly rigorous "Single Image Extraction Prompt" that I can use to iteratively query a Multimodal Large Language Model (LMM) in my automated pipeline.</w:t>
+      </w:r>
+    </w:p>
+    <w:p>
+      <w:pPr>
+        <w:rPr>
+          <w:rFonts w:ascii="Times New Roman" w:hAnsi="Times New Roman" w:cs="Times New Roman"/>
+        </w:rPr>
+      </w:pPr>
+      <w:r>
+        <w:rPr>
+          <w:rFonts w:ascii="Times New Roman" w:hAnsi="Times New Roman" w:cs="Times New Roman"/>
+        </w:rPr>
+        <w:t xml:space="preserve">The generated prompt must specifically instruct the target LMM to </w:t>
+      </w:r>
+      <w:proofErr w:type="spellStart"/>
+      <w:r>
+        <w:rPr>
+          <w:rFonts w:ascii="Times New Roman" w:hAnsi="Times New Roman" w:cs="Times New Roman"/>
+        </w:rPr>
+        <w:t>analyze</w:t>
+      </w:r>
+      <w:proofErr w:type="spellEnd"/>
+      <w:r>
+        <w:rPr>
+          <w:rFonts w:ascii="Times New Roman" w:hAnsi="Times New Roman" w:cs="Times New Roman"/>
+        </w:rPr>
+        <w:t xml:space="preserve"> a single camera-trap image of a </w:t>
+      </w:r>
+      <w:r>
+        <w:rPr>
+          <w:rFonts w:ascii="Times New Roman" w:hAnsi="Times New Roman" w:cs="Times New Roman"/>
+          <w:b/>
+          <w:bCs/>
+        </w:rPr>
+        <w:t>[</w:t>
+      </w:r>
+      <w:r>
+        <w:rPr>
+          <w:rFonts w:ascii="Times New Roman" w:hAnsi="Times New Roman" w:cs="Times New Roman" w:hint="eastAsia"/>
+          <w:b/>
+          <w:bCs/>
+        </w:rPr>
+        <w:t>Species Name</w:t>
+      </w:r>
+      <w:r>
+        <w:rPr>
+          <w:rFonts w:ascii="Times New Roman" w:hAnsi="Times New Roman" w:cs="Times New Roman"/>
+          <w:b/>
+          <w:bCs/>
+        </w:rPr>
+        <w:t>]</w:t>
+      </w:r>
+      <w:r>
+        <w:rPr>
+          <w:rFonts w:ascii="Times New Roman" w:hAnsi="Times New Roman" w:cs="Times New Roman"/>
+        </w:rPr>
+        <w:t xml:space="preserve"> and output a strict JSON object representing its visual features.</w:t>
+      </w:r>
+    </w:p>
+    <w:p>
+      <w:pPr>
+        <w:rPr>
+          <w:rFonts w:ascii="Times New Roman" w:hAnsi="Times New Roman" w:cs="Times New Roman"/>
+        </w:rPr>
+      </w:pPr>
+      <w:r>
+        <w:rPr>
+          <w:rFonts w:ascii="Times New Roman" w:hAnsi="Times New Roman" w:cs="Times New Roman"/>
+          <w:b/>
+          <w:bCs/>
+        </w:rPr>
+        <w:t>Input Viable Ontology:</w:t>
+      </w:r>
+    </w:p>
+    <w:p>
+      <w:pPr>
+        <w:rPr>
+          <w:rFonts w:ascii="Times New Roman" w:hAnsi="Times New Roman" w:cs="Times New Roman"/>
+        </w:rPr>
+      </w:pPr>
+      <w:r>
+        <w:rPr>
+          <w:rFonts w:ascii="Times New Roman" w:hAnsi="Times New Roman" w:cs="Times New Roman"/>
+        </w:rPr>
+        <w:t>&lt;</w:t>
+      </w:r>
+      <w:proofErr w:type="spellStart"/>
+      <w:r>
+        <w:rPr>
+          <w:rFonts w:ascii="Times New Roman" w:hAnsi="Times New Roman" w:cs="Times New Roman"/>
+        </w:rPr>
+        <w:t>viable_ontology</w:t>
+      </w:r>
+      <w:proofErr w:type="spellEnd"/>
+      <w:r>
+        <w:rPr>
+          <w:rFonts w:ascii="Times New Roman" w:hAnsi="Times New Roman" w:cs="Times New Roman"/>
+        </w:rPr>
+        <w:t>&gt;</w:t>
+      </w:r>
+    </w:p>
+    <w:p>
+      <w:pPr>
+        <w:rPr>
+          <w:rFonts w:ascii="Times New Roman" w:hAnsi="Times New Roman" w:cs="Times New Roman"/>
+        </w:rPr>
+      </w:pPr>
+      <w:r>
+        <w:rPr>
+          <w:rFonts w:ascii="Times New Roman" w:hAnsi="Times New Roman" w:cs="Times New Roman"/>
+        </w:rPr>
+        <w:t>&lt;/</w:t>
+      </w:r>
+      <w:proofErr w:type="spellStart"/>
+      <w:r>
+        <w:rPr>
+          <w:rFonts w:ascii="Times New Roman" w:hAnsi="Times New Roman" w:cs="Times New Roman"/>
+        </w:rPr>
+        <w:t>viable_ontology</w:t>
+      </w:r>
+      <w:proofErr w:type="spellEnd"/>
+      <w:r>
+        <w:rPr>
+          <w:rFonts w:ascii="Times New Roman" w:hAnsi="Times New Roman" w:cs="Times New Roman"/>
+        </w:rPr>
+        <w:t>&gt;</w:t>
+      </w:r>
+    </w:p>
+    <w:p>
+      <w:pPr>
+        <w:rPr>
+          <w:rFonts w:ascii="Times New Roman" w:hAnsi="Times New Roman" w:cs="Times New Roman"/>
+        </w:rPr>
+      </w:pPr>
+      <w:r>
+        <w:rPr>
+          <w:rFonts w:ascii="Times New Roman" w:hAnsi="Times New Roman" w:cs="Times New Roman"/>
+          <w:b/>
+          <w:bCs/>
+        </w:rPr>
+        <w:t>Requirements for the Generated Prompt:</w:t>
+      </w:r>
+    </w:p>
+    <w:p>
+      <w:pPr>
+        <w:rPr>
+          <w:rFonts w:ascii="Times New Roman" w:hAnsi="Times New Roman" w:cs="Times New Roman"/>
+        </w:rPr>
+      </w:pPr>
+      <w:r>
+        <w:rPr>
+          <w:rFonts w:ascii="Times New Roman" w:hAnsi="Times New Roman" w:cs="Times New Roman"/>
+        </w:rPr>
+        <w:t>Your generated prompt must include the following structural elements:</w:t>
+      </w:r>
+    </w:p>
+    <w:p>
+      <w:pPr>
+        <w:numPr>
+          <w:ilvl w:val="0"/>
+          <w:numId w:val="23"/>
+        </w:numPr>
+        <w:rPr>
+          <w:rFonts w:ascii="Times New Roman" w:hAnsi="Times New Roman" w:cs="Times New Roman"/>
+        </w:rPr>
+      </w:pPr>
+      <w:r>
+        <w:rPr>
+          <w:rFonts w:ascii="Times New Roman" w:hAnsi="Times New Roman" w:cs="Times New Roman"/>
+          <w:b/>
+          <w:bCs/>
+        </w:rPr>
+        <w:t>Role Definition:</w:t>
+      </w:r>
+      <w:r>
+        <w:rPr>
+          <w:rFonts w:ascii="Times New Roman" w:hAnsi="Times New Roman" w:cs="Times New Roman"/>
+        </w:rPr>
+        <w:t xml:space="preserve"> Instruct the target LMM to act as an objective, pixel-focused computer vision data annotator specializing in </w:t>
+      </w:r>
+      <w:r>
+        <w:rPr>
+          <w:rFonts w:ascii="Times New Roman" w:hAnsi="Times New Roman" w:cs="Times New Roman"/>
+          <w:b/>
+          <w:bCs/>
+        </w:rPr>
+        <w:t>[</w:t>
+      </w:r>
+      <w:r>
+        <w:rPr>
+          <w:rFonts w:ascii="Times New Roman" w:hAnsi="Times New Roman" w:cs="Times New Roman" w:hint="eastAsia"/>
+          <w:b/>
+          <w:bCs/>
+        </w:rPr>
+        <w:t>Species Name</w:t>
+      </w:r>
+      <w:r>
+        <w:rPr>
+          <w:rFonts w:ascii="Times New Roman" w:hAnsi="Times New Roman" w:cs="Times New Roman"/>
+          <w:b/>
+          <w:bCs/>
+        </w:rPr>
+        <w:t>]</w:t>
+      </w:r>
+      <w:r>
+        <w:rPr>
+          <w:rFonts w:ascii="Times New Roman" w:hAnsi="Times New Roman" w:cs="Times New Roman"/>
+        </w:rPr>
+        <w:t>, strictly avoiding biological assumptions not visible in the image.</w:t>
+      </w:r>
+    </w:p>
+    <w:p>
+      <w:pPr>
+        <w:numPr>
+          <w:ilvl w:val="0"/>
+          <w:numId w:val="23"/>
+        </w:numPr>
+        <w:rPr>
+          <w:rFonts w:ascii="Times New Roman" w:hAnsi="Times New Roman" w:cs="Times New Roman"/>
+        </w:rPr>
+      </w:pPr>
+      <w:r>
+        <w:rPr>
+          <w:rFonts w:ascii="Times New Roman" w:hAnsi="Times New Roman" w:cs="Times New Roman"/>
+          <w:b/>
+          <w:bCs/>
+        </w:rPr>
+        <w:t>JSON Schema Translation:</w:t>
+      </w:r>
+      <w:r>
+        <w:rPr>
+          <w:rFonts w:ascii="Times New Roman" w:hAnsi="Times New Roman" w:cs="Times New Roman"/>
+        </w:rPr>
+        <w:t xml:space="preserve"> Translate the &lt;</w:t>
+      </w:r>
+      <w:proofErr w:type="spellStart"/>
+      <w:r>
+        <w:rPr>
+          <w:rFonts w:ascii="Times New Roman" w:hAnsi="Times New Roman" w:cs="Times New Roman"/>
+        </w:rPr>
+        <w:t>viable_ontology</w:t>
+      </w:r>
+      <w:proofErr w:type="spellEnd"/>
+      <w:r>
+        <w:rPr>
+          <w:rFonts w:ascii="Times New Roman" w:hAnsi="Times New Roman" w:cs="Times New Roman"/>
+        </w:rPr>
+        <w:t xml:space="preserve">&gt; into a strictly typed, hierarchical JSON Schema template. The keys must be in </w:t>
+      </w:r>
+      <w:proofErr w:type="spellStart"/>
+      <w:r>
+        <w:rPr>
+          <w:rFonts w:ascii="Times New Roman" w:hAnsi="Times New Roman" w:cs="Times New Roman"/>
+        </w:rPr>
+        <w:t>snake_case</w:t>
+      </w:r>
+      <w:proofErr w:type="spellEnd"/>
+      <w:r>
+        <w:rPr>
+          <w:rFonts w:ascii="Times New Roman" w:hAnsi="Times New Roman" w:cs="Times New Roman"/>
+        </w:rPr>
+        <w:t>.</w:t>
+      </w:r>
+    </w:p>
+    <w:p>
+      <w:pPr>
+        <w:numPr>
+          <w:ilvl w:val="0"/>
+          <w:numId w:val="23"/>
+        </w:numPr>
+        <w:rPr>
+          <w:rFonts w:ascii="Times New Roman" w:hAnsi="Times New Roman" w:cs="Times New Roman"/>
+        </w:rPr>
+      </w:pPr>
+      <w:r>
+        <w:rPr>
+          <w:rFonts w:ascii="Times New Roman" w:hAnsi="Times New Roman" w:cs="Times New Roman"/>
+          <w:b/>
+          <w:bCs/>
+        </w:rPr>
+        <w:t>The Absolute "Null" Rule (Anti-Hallucination):</w:t>
+      </w:r>
+      <w:r>
+        <w:rPr>
+          <w:rFonts w:ascii="Times New Roman" w:hAnsi="Times New Roman" w:cs="Times New Roman"/>
+        </w:rPr>
+        <w:t xml:space="preserve"> You must forcefully instruct the target LMM that if a specific feature is blurry, occluded by shadows/foliage, or out of the Field of View, it MUST output null for that JSON field. Guessing based on species priors is strictly forbidden.</w:t>
+      </w:r>
+    </w:p>
+    <w:p>
+      <w:pPr>
+        <w:numPr>
+          <w:ilvl w:val="0"/>
+          <w:numId w:val="23"/>
+        </w:numPr>
+        <w:rPr>
+          <w:rFonts w:ascii="Times New Roman" w:hAnsi="Times New Roman" w:cs="Times New Roman"/>
+        </w:rPr>
+      </w:pPr>
+      <w:r>
+        <w:rPr>
+          <w:rFonts w:ascii="Times New Roman" w:hAnsi="Times New Roman" w:cs="Times New Roman"/>
+          <w:b/>
+          <w:bCs/>
+        </w:rPr>
+        <w:t>Mandatory Catch-all Fields:</w:t>
+      </w:r>
+      <w:r>
+        <w:rPr>
+          <w:rFonts w:ascii="Times New Roman" w:hAnsi="Times New Roman" w:cs="Times New Roman"/>
+        </w:rPr>
+        <w:t xml:space="preserve"> Regardless of the input ontology, you MUST append these two universal open fields at the bottom of the JSON schema to capture long-tail </w:t>
+      </w:r>
+      <w:proofErr w:type="spellStart"/>
+      <w:r>
+        <w:rPr>
+          <w:rFonts w:ascii="Times New Roman" w:hAnsi="Times New Roman" w:cs="Times New Roman"/>
+        </w:rPr>
+        <w:t>ReID</w:t>
+      </w:r>
+      <w:proofErr w:type="spellEnd"/>
+      <w:r>
+        <w:rPr>
+          <w:rFonts w:ascii="Times New Roman" w:hAnsi="Times New Roman" w:cs="Times New Roman"/>
+        </w:rPr>
+        <w:t xml:space="preserve"> traits:</w:t>
+      </w:r>
+    </w:p>
+    <w:p>
+      <w:pPr>
+        <w:numPr>
+          <w:ilvl w:val="1"/>
+          <w:numId w:val="23"/>
+        </w:numPr>
+        <w:rPr>
+          <w:rFonts w:ascii="Times New Roman" w:hAnsi="Times New Roman" w:cs="Times New Roman"/>
+        </w:rPr>
+      </w:pPr>
+      <w:r>
+        <w:rPr>
+          <w:rFonts w:ascii="Times New Roman" w:hAnsi="Times New Roman" w:cs="Times New Roman"/>
+        </w:rPr>
+        <w:t>"</w:t>
+      </w:r>
+      <w:proofErr w:type="spellStart"/>
+      <w:proofErr w:type="gramStart"/>
+      <w:r>
+        <w:rPr>
+          <w:rFonts w:ascii="Times New Roman" w:hAnsi="Times New Roman" w:cs="Times New Roman"/>
+        </w:rPr>
+        <w:t>acquired</w:t>
+      </w:r>
+      <w:proofErr w:type="gramEnd"/>
+      <w:r>
+        <w:rPr>
+          <w:rFonts w:ascii="Times New Roman" w:hAnsi="Times New Roman" w:cs="Times New Roman"/>
+        </w:rPr>
+        <w:t>_anomalies_or_scars</w:t>
+      </w:r>
+      <w:proofErr w:type="spellEnd"/>
+      <w:r>
+        <w:rPr>
+          <w:rFonts w:ascii="Times New Roman" w:hAnsi="Times New Roman" w:cs="Times New Roman"/>
+        </w:rPr>
+        <w:t>": To capture any visible physical trauma, amputations, parasitic lesions, or unique temporal marks.</w:t>
+      </w:r>
+    </w:p>
+    <w:p>
+      <w:pPr>
+        <w:numPr>
+          <w:ilvl w:val="1"/>
+          <w:numId w:val="23"/>
+        </w:numPr>
+        <w:rPr>
+          <w:rFonts w:ascii="Times New Roman" w:hAnsi="Times New Roman" w:cs="Times New Roman"/>
+        </w:rPr>
+      </w:pPr>
+      <w:r>
+        <w:rPr>
+          <w:rFonts w:ascii="Times New Roman" w:hAnsi="Times New Roman" w:cs="Times New Roman"/>
+        </w:rPr>
+        <w:lastRenderedPageBreak/>
+        <w:t>"</w:t>
+      </w:r>
+      <w:proofErr w:type="spellStart"/>
+      <w:proofErr w:type="gramStart"/>
+      <w:r>
+        <w:rPr>
+          <w:rFonts w:ascii="Times New Roman" w:hAnsi="Times New Roman" w:cs="Times New Roman"/>
+        </w:rPr>
+        <w:t>other</w:t>
+      </w:r>
+      <w:proofErr w:type="gramEnd"/>
+      <w:r>
+        <w:rPr>
+          <w:rFonts w:ascii="Times New Roman" w:hAnsi="Times New Roman" w:cs="Times New Roman"/>
+        </w:rPr>
+        <w:t>_distinctive_markers</w:t>
+      </w:r>
+      <w:proofErr w:type="spellEnd"/>
+      <w:r>
+        <w:rPr>
+          <w:rFonts w:ascii="Times New Roman" w:hAnsi="Times New Roman" w:cs="Times New Roman"/>
+        </w:rPr>
+        <w:t>": To capture any highly unique visual feature not covered by the main ontology.</w:t>
+      </w:r>
+    </w:p>
+    <w:p>
+      <w:pPr>
+        <w:numPr>
+          <w:ilvl w:val="0"/>
+          <w:numId w:val="23"/>
+        </w:numPr>
+        <w:rPr>
+          <w:rFonts w:ascii="Times New Roman" w:hAnsi="Times New Roman" w:cs="Times New Roman"/>
+        </w:rPr>
+      </w:pPr>
+      <w:r>
+        <w:rPr>
+          <w:rFonts w:ascii="Times New Roman" w:hAnsi="Times New Roman" w:cs="Times New Roman"/>
+          <w:b/>
+          <w:bCs/>
+        </w:rPr>
+        <w:t>Strict Output Constraints:</w:t>
+      </w:r>
+      <w:r>
+        <w:rPr>
+          <w:rFonts w:ascii="Times New Roman" w:hAnsi="Times New Roman" w:cs="Times New Roman"/>
+        </w:rPr>
+        <w:t xml:space="preserve"> The generated prompt must command the target LMM to output ONLY the valid JSON object. It must explicitly forbid markdown code blocks (e.g., no ```</w:t>
+      </w:r>
+      <w:proofErr w:type="spellStart"/>
+      <w:r>
+        <w:rPr>
+          <w:rFonts w:ascii="Times New Roman" w:hAnsi="Times New Roman" w:cs="Times New Roman"/>
+        </w:rPr>
+        <w:t>json</w:t>
+      </w:r>
+      <w:proofErr w:type="spellEnd"/>
+      <w:r>
+        <w:rPr>
+          <w:rFonts w:ascii="Times New Roman" w:hAnsi="Times New Roman" w:cs="Times New Roman"/>
+        </w:rPr>
+        <w:t xml:space="preserve">), conversational filler, or explanatory text, as this output will be parsed directly by a Python </w:t>
+      </w:r>
+      <w:proofErr w:type="spellStart"/>
+      <w:proofErr w:type="gramStart"/>
+      <w:r>
+        <w:rPr>
+          <w:rFonts w:ascii="Times New Roman" w:hAnsi="Times New Roman" w:cs="Times New Roman"/>
+        </w:rPr>
+        <w:t>json.loads</w:t>
+      </w:r>
+      <w:proofErr w:type="spellEnd"/>
+      <w:proofErr w:type="gramEnd"/>
+      <w:r>
+        <w:rPr>
+          <w:rFonts w:ascii="Times New Roman" w:hAnsi="Times New Roman" w:cs="Times New Roman"/>
+        </w:rPr>
+        <w:t>() function.</w:t>
+      </w:r>
+    </w:p>
+    <w:p>
+      <w:pPr>
+        <w:rPr>
+          <w:rFonts w:ascii="Times New Roman" w:hAnsi="Times New Roman" w:cs="Times New Roman"/>
+        </w:rPr>
+      </w:pPr>
+      <w:r>
+        <w:rPr>
+          <w:rFonts w:ascii="Times New Roman" w:hAnsi="Times New Roman" w:cs="Times New Roman"/>
+          <w:b/>
+          <w:bCs/>
+        </w:rPr>
+        <w:t>Output Format:</w:t>
+      </w:r>
+    </w:p>
+    <w:p>
+      <w:pPr>
+        <w:rPr>
+          <w:rFonts w:ascii="Times New Roman" w:hAnsi="Times New Roman" w:cs="Times New Roman"/>
+        </w:rPr>
+      </w:pPr>
+      <w:r>
+        <w:rPr>
+          <w:rFonts w:ascii="Times New Roman" w:hAnsi="Times New Roman" w:cs="Times New Roman"/>
+        </w:rPr>
+        <w:t>Please output the final "Single Image Extraction Prompt" inside a single text block so I can easily copy it into my Python script.</w:t>
       </w:r>
     </w:p>
     <w:sectPr>
@@ -2990,6 +2689,155 @@
 <file path=word/numbering.xml><?xml version="1.0" encoding="utf-8"?>
 <w:numbering xmlns:wpc="http://schemas.microsoft.com/office/word/2010/wordprocessingCanvas" xmlns:cx="http://schemas.microsoft.com/office/drawing/2014/chartex" xmlns:cx1="http://schemas.microsoft.com/office/drawing/2015/9/8/chartex" xmlns:cx2="http://schemas.microsoft.com/office/drawing/2015/10/21/chartex" xmlns:cx3="http://schemas.microsoft.com/office/drawing/2016/5/9/chartex" xmlns:cx4="http://schemas.microsoft.com/office/drawing/2016/5/10/chartex" xmlns:cx5="http://schemas.microsoft.com/office/drawing/2016/5/11/chartex" xmlns:cx6="http://schemas.microsoft.com/office/drawing/2016/5/12/chartex" xmlns:cx7="http://schemas.microsoft.com/office/drawing/2016/5/13/chartex" xmlns:cx8="http://schemas.microsoft.com/office/drawing/2016/5/14/chartex" xmlns:mc="http://schemas.openxmlformats.org/markup-compatibility/2006" xmlns:aink="http://schemas.microsoft.com/office/drawing/2016/ink" xmlns:am3d="http://schemas.microsoft.com/office/drawing/2017/model3d" xmlns:o="urn:schemas-microsoft-com:office:office" xmlns:oel="http://schemas.microsoft.com/office/2019/extlst" xmlns:r="http://schemas.openxmlformats.org/officeDocument/2006/relationships" xmlns:m="http://schemas.openxmlformats.org/officeDocument/2006/math" xmlns:v="urn:schemas-microsoft-com:vml" xmlns:wp14="http://schemas.microsoft.com/office/word/2010/wordprocessingDrawing" xmlns:wp="http://schemas.openxmlformats.org/drawingml/2006/wordprocessingDrawing" xmlns:w10="urn:schemas-microsoft-com:office:word" xmlns:w="http://schemas.openxmlformats.org/wordprocessingml/2006/main" xmlns:w14="http://schemas.microsoft.com/office/word/2010/wordml" xmlns:w15="http://schemas.microsoft.com/office/word/2012/wordml" xmlns:w16cex="http://schemas.microsoft.com/office/word/2018/wordml/cex" xmlns:w16cid="http://schemas.microsoft.com/office/word/2016/wordml/cid" xmlns:w16="http://schemas.microsoft.com/office/word/2018/wordml" xmlns:w16du="http://schemas.microsoft.com/office/word/2023/wordml/word16du" xmlns:w16sdtdh="http://schemas.microsoft.com/office/word/2020/wordml/sdtdatahash" xmlns:w16sdtfl="http://schemas.microsoft.com/office/word/2024/wordml/sdtformatlock" xmlns:w16se="http://schemas.microsoft.com/office/word/2015/wordml/symex" xmlns:wpg="http://schemas.microsoft.com/office/word/2010/wordprocessingGroup" xmlns:wpi="http://schemas.microsoft.com/office/word/2010/wordprocessingInk" xmlns:wne="http://schemas.microsoft.com/office/word/2006/wordml" xmlns:wps="http://schemas.microsoft.com/office/word/2010/wordprocessingShape" mc:Ignorable="w14 w15 w16se w16cid w16 w16cex w16sdtdh w16sdtfl w16du wp14">
   <w:abstractNum w:abstractNumId="0" w15:restartNumberingAfterBreak="0">
+    <w:nsid w:val="09AF29CA"/>
+    <w:multiLevelType w:val="multilevel"/>
+    <w:tmpl w:val="C68EE68A"/>
+    <w:lvl w:ilvl="0">
+      <w:start w:val="1"/>
+      <w:numFmt w:val="bullet"/>
+      <w:lvlText w:val=""/>
+      <w:lvlJc w:val="left"/>
+      <w:pPr>
+        <w:tabs>
+          <w:tab w:val="num" w:pos="720"/>
+        </w:tabs>
+        <w:ind w:left="720" w:hanging="360"/>
+      </w:pPr>
+      <w:rPr>
+        <w:rFonts w:ascii="Symbol" w:hAnsi="Symbol" w:hint="default"/>
+        <w:sz w:val="20"/>
+      </w:rPr>
+    </w:lvl>
+    <w:lvl w:ilvl="1" w:tentative="1">
+      <w:start w:val="1"/>
+      <w:numFmt w:val="bullet"/>
+      <w:lvlText w:val="o"/>
+      <w:lvlJc w:val="left"/>
+      <w:pPr>
+        <w:tabs>
+          <w:tab w:val="num" w:pos="1440"/>
+        </w:tabs>
+        <w:ind w:left="1440" w:hanging="360"/>
+      </w:pPr>
+      <w:rPr>
+        <w:rFonts w:ascii="Courier New" w:hAnsi="Courier New" w:hint="default"/>
+        <w:sz w:val="20"/>
+      </w:rPr>
+    </w:lvl>
+    <w:lvl w:ilvl="2" w:tentative="1">
+      <w:start w:val="1"/>
+      <w:numFmt w:val="bullet"/>
+      <w:lvlText w:val=""/>
+      <w:lvlJc w:val="left"/>
+      <w:pPr>
+        <w:tabs>
+          <w:tab w:val="num" w:pos="2160"/>
+        </w:tabs>
+        <w:ind w:left="2160" w:hanging="360"/>
+      </w:pPr>
+      <w:rPr>
+        <w:rFonts w:ascii="Wingdings" w:hAnsi="Wingdings" w:hint="default"/>
+        <w:sz w:val="20"/>
+      </w:rPr>
+    </w:lvl>
+    <w:lvl w:ilvl="3" w:tentative="1">
+      <w:start w:val="1"/>
+      <w:numFmt w:val="bullet"/>
+      <w:lvlText w:val=""/>
+      <w:lvlJc w:val="left"/>
+      <w:pPr>
+        <w:tabs>
+          <w:tab w:val="num" w:pos="2880"/>
+        </w:tabs>
+        <w:ind w:left="2880" w:hanging="360"/>
+      </w:pPr>
+      <w:rPr>
+        <w:rFonts w:ascii="Wingdings" w:hAnsi="Wingdings" w:hint="default"/>
+        <w:sz w:val="20"/>
+      </w:rPr>
+    </w:lvl>
+    <w:lvl w:ilvl="4" w:tentative="1">
+      <w:start w:val="1"/>
+      <w:numFmt w:val="bullet"/>
+      <w:lvlText w:val=""/>
+      <w:lvlJc w:val="left"/>
+      <w:pPr>
+        <w:tabs>
+          <w:tab w:val="num" w:pos="3600"/>
+        </w:tabs>
+        <w:ind w:left="3600" w:hanging="360"/>
+      </w:pPr>
+      <w:rPr>
+        <w:rFonts w:ascii="Wingdings" w:hAnsi="Wingdings" w:hint="default"/>
+        <w:sz w:val="20"/>
+      </w:rPr>
+    </w:lvl>
+    <w:lvl w:ilvl="5" w:tentative="1">
+      <w:start w:val="1"/>
+      <w:numFmt w:val="bullet"/>
+      <w:lvlText w:val=""/>
+      <w:lvlJc w:val="left"/>
+      <w:pPr>
+        <w:tabs>
+          <w:tab w:val="num" w:pos="4320"/>
+        </w:tabs>
+        <w:ind w:left="4320" w:hanging="360"/>
+      </w:pPr>
+      <w:rPr>
+        <w:rFonts w:ascii="Wingdings" w:hAnsi="Wingdings" w:hint="default"/>
+        <w:sz w:val="20"/>
+      </w:rPr>
+    </w:lvl>
+    <w:lvl w:ilvl="6" w:tentative="1">
+      <w:start w:val="1"/>
+      <w:numFmt w:val="bullet"/>
+      <w:lvlText w:val=""/>
+      <w:lvlJc w:val="left"/>
+      <w:pPr>
+        <w:tabs>
+          <w:tab w:val="num" w:pos="5040"/>
+        </w:tabs>
+        <w:ind w:left="5040" w:hanging="360"/>
+      </w:pPr>
+      <w:rPr>
+        <w:rFonts w:ascii="Wingdings" w:hAnsi="Wingdings" w:hint="default"/>
+        <w:sz w:val="20"/>
+      </w:rPr>
+    </w:lvl>
+    <w:lvl w:ilvl="7" w:tentative="1">
+      <w:start w:val="1"/>
+      <w:numFmt w:val="bullet"/>
+      <w:lvlText w:val=""/>
+      <w:lvlJc w:val="left"/>
+      <w:pPr>
+        <w:tabs>
+          <w:tab w:val="num" w:pos="5760"/>
+        </w:tabs>
+        <w:ind w:left="5760" w:hanging="360"/>
+      </w:pPr>
+      <w:rPr>
+        <w:rFonts w:ascii="Wingdings" w:hAnsi="Wingdings" w:hint="default"/>
+        <w:sz w:val="20"/>
+      </w:rPr>
+    </w:lvl>
+    <w:lvl w:ilvl="8" w:tentative="1">
+      <w:start w:val="1"/>
+      <w:numFmt w:val="bullet"/>
+      <w:lvlText w:val=""/>
+      <w:lvlJc w:val="left"/>
+      <w:pPr>
+        <w:tabs>
+          <w:tab w:val="num" w:pos="6480"/>
+        </w:tabs>
+        <w:ind w:left="6480" w:hanging="360"/>
+      </w:pPr>
+      <w:rPr>
+        <w:rFonts w:ascii="Wingdings" w:hAnsi="Wingdings" w:hint="default"/>
+        <w:sz w:val="20"/>
+      </w:rPr>
+    </w:lvl>
+  </w:abstractNum>
+  <w:abstractNum w:abstractNumId="1" w15:restartNumberingAfterBreak="0">
     <w:nsid w:val="0B3A592E"/>
     <w:multiLevelType w:val="multilevel"/>
     <w:tmpl w:val="3078EE3E"/>
@@ -3106,7 +2954,7 @@
       </w:pPr>
     </w:lvl>
   </w:abstractNum>
-  <w:abstractNum w:abstractNumId="1" w15:restartNumberingAfterBreak="0">
+  <w:abstractNum w:abstractNumId="2" w15:restartNumberingAfterBreak="0">
     <w:nsid w:val="0EB14C88"/>
     <w:multiLevelType w:val="multilevel"/>
     <w:tmpl w:val="91645044"/>
@@ -3255,7 +3103,156 @@
       </w:rPr>
     </w:lvl>
   </w:abstractNum>
-  <w:abstractNum w:abstractNumId="2" w15:restartNumberingAfterBreak="0">
+  <w:abstractNum w:abstractNumId="3" w15:restartNumberingAfterBreak="0">
+    <w:nsid w:val="0FEB6C34"/>
+    <w:multiLevelType w:val="multilevel"/>
+    <w:tmpl w:val="C2B8A8D4"/>
+    <w:lvl w:ilvl="0">
+      <w:start w:val="1"/>
+      <w:numFmt w:val="bullet"/>
+      <w:lvlText w:val=""/>
+      <w:lvlJc w:val="left"/>
+      <w:pPr>
+        <w:tabs>
+          <w:tab w:val="num" w:pos="720"/>
+        </w:tabs>
+        <w:ind w:left="720" w:hanging="360"/>
+      </w:pPr>
+      <w:rPr>
+        <w:rFonts w:ascii="Symbol" w:hAnsi="Symbol" w:hint="default"/>
+        <w:sz w:val="20"/>
+      </w:rPr>
+    </w:lvl>
+    <w:lvl w:ilvl="1" w:tentative="1">
+      <w:start w:val="1"/>
+      <w:numFmt w:val="bullet"/>
+      <w:lvlText w:val="o"/>
+      <w:lvlJc w:val="left"/>
+      <w:pPr>
+        <w:tabs>
+          <w:tab w:val="num" w:pos="1440"/>
+        </w:tabs>
+        <w:ind w:left="1440" w:hanging="360"/>
+      </w:pPr>
+      <w:rPr>
+        <w:rFonts w:ascii="Courier New" w:hAnsi="Courier New" w:hint="default"/>
+        <w:sz w:val="20"/>
+      </w:rPr>
+    </w:lvl>
+    <w:lvl w:ilvl="2" w:tentative="1">
+      <w:start w:val="1"/>
+      <w:numFmt w:val="bullet"/>
+      <w:lvlText w:val=""/>
+      <w:lvlJc w:val="left"/>
+      <w:pPr>
+        <w:tabs>
+          <w:tab w:val="num" w:pos="2160"/>
+        </w:tabs>
+        <w:ind w:left="2160" w:hanging="360"/>
+      </w:pPr>
+      <w:rPr>
+        <w:rFonts w:ascii="Wingdings" w:hAnsi="Wingdings" w:hint="default"/>
+        <w:sz w:val="20"/>
+      </w:rPr>
+    </w:lvl>
+    <w:lvl w:ilvl="3" w:tentative="1">
+      <w:start w:val="1"/>
+      <w:numFmt w:val="bullet"/>
+      <w:lvlText w:val=""/>
+      <w:lvlJc w:val="left"/>
+      <w:pPr>
+        <w:tabs>
+          <w:tab w:val="num" w:pos="2880"/>
+        </w:tabs>
+        <w:ind w:left="2880" w:hanging="360"/>
+      </w:pPr>
+      <w:rPr>
+        <w:rFonts w:ascii="Wingdings" w:hAnsi="Wingdings" w:hint="default"/>
+        <w:sz w:val="20"/>
+      </w:rPr>
+    </w:lvl>
+    <w:lvl w:ilvl="4" w:tentative="1">
+      <w:start w:val="1"/>
+      <w:numFmt w:val="bullet"/>
+      <w:lvlText w:val=""/>
+      <w:lvlJc w:val="left"/>
+      <w:pPr>
+        <w:tabs>
+          <w:tab w:val="num" w:pos="3600"/>
+        </w:tabs>
+        <w:ind w:left="3600" w:hanging="360"/>
+      </w:pPr>
+      <w:rPr>
+        <w:rFonts w:ascii="Wingdings" w:hAnsi="Wingdings" w:hint="default"/>
+        <w:sz w:val="20"/>
+      </w:rPr>
+    </w:lvl>
+    <w:lvl w:ilvl="5" w:tentative="1">
+      <w:start w:val="1"/>
+      <w:numFmt w:val="bullet"/>
+      <w:lvlText w:val=""/>
+      <w:lvlJc w:val="left"/>
+      <w:pPr>
+        <w:tabs>
+          <w:tab w:val="num" w:pos="4320"/>
+        </w:tabs>
+        <w:ind w:left="4320" w:hanging="360"/>
+      </w:pPr>
+      <w:rPr>
+        <w:rFonts w:ascii="Wingdings" w:hAnsi="Wingdings" w:hint="default"/>
+        <w:sz w:val="20"/>
+      </w:rPr>
+    </w:lvl>
+    <w:lvl w:ilvl="6" w:tentative="1">
+      <w:start w:val="1"/>
+      <w:numFmt w:val="bullet"/>
+      <w:lvlText w:val=""/>
+      <w:lvlJc w:val="left"/>
+      <w:pPr>
+        <w:tabs>
+          <w:tab w:val="num" w:pos="5040"/>
+        </w:tabs>
+        <w:ind w:left="5040" w:hanging="360"/>
+      </w:pPr>
+      <w:rPr>
+        <w:rFonts w:ascii="Wingdings" w:hAnsi="Wingdings" w:hint="default"/>
+        <w:sz w:val="20"/>
+      </w:rPr>
+    </w:lvl>
+    <w:lvl w:ilvl="7" w:tentative="1">
+      <w:start w:val="1"/>
+      <w:numFmt w:val="bullet"/>
+      <w:lvlText w:val=""/>
+      <w:lvlJc w:val="left"/>
+      <w:pPr>
+        <w:tabs>
+          <w:tab w:val="num" w:pos="5760"/>
+        </w:tabs>
+        <w:ind w:left="5760" w:hanging="360"/>
+      </w:pPr>
+      <w:rPr>
+        <w:rFonts w:ascii="Wingdings" w:hAnsi="Wingdings" w:hint="default"/>
+        <w:sz w:val="20"/>
+      </w:rPr>
+    </w:lvl>
+    <w:lvl w:ilvl="8" w:tentative="1">
+      <w:start w:val="1"/>
+      <w:numFmt w:val="bullet"/>
+      <w:lvlText w:val=""/>
+      <w:lvlJc w:val="left"/>
+      <w:pPr>
+        <w:tabs>
+          <w:tab w:val="num" w:pos="6480"/>
+        </w:tabs>
+        <w:ind w:left="6480" w:hanging="360"/>
+      </w:pPr>
+      <w:rPr>
+        <w:rFonts w:ascii="Wingdings" w:hAnsi="Wingdings" w:hint="default"/>
+        <w:sz w:val="20"/>
+      </w:rPr>
+    </w:lvl>
+  </w:abstractNum>
+  <w:abstractNum w:abstractNumId="4" w15:restartNumberingAfterBreak="0">
     <w:nsid w:val="11563117"/>
     <w:multiLevelType w:val="multilevel"/>
     <w:tmpl w:val="D91CA08E"/>
@@ -3404,7 +3401,7 @@
       </w:rPr>
     </w:lvl>
   </w:abstractNum>
-  <w:abstractNum w:abstractNumId="3" w15:restartNumberingAfterBreak="0">
+  <w:abstractNum w:abstractNumId="5" w15:restartNumberingAfterBreak="0">
     <w:nsid w:val="2045304E"/>
     <w:multiLevelType w:val="multilevel"/>
     <w:tmpl w:val="B0D2F01A"/>
@@ -3553,7 +3550,124 @@
       </w:rPr>
     </w:lvl>
   </w:abstractNum>
-  <w:abstractNum w:abstractNumId="4" w15:restartNumberingAfterBreak="0">
+  <w:abstractNum w:abstractNumId="6" w15:restartNumberingAfterBreak="0">
+    <w:nsid w:val="22F83F6A"/>
+    <w:multiLevelType w:val="multilevel"/>
+    <w:tmpl w:val="21460706"/>
+    <w:lvl w:ilvl="0">
+      <w:start w:val="1"/>
+      <w:numFmt w:val="decimal"/>
+      <w:lvlText w:val="%1."/>
+      <w:lvlJc w:val="left"/>
+      <w:pPr>
+        <w:tabs>
+          <w:tab w:val="num" w:pos="720"/>
+        </w:tabs>
+        <w:ind w:left="720" w:hanging="360"/>
+      </w:pPr>
+    </w:lvl>
+    <w:lvl w:ilvl="1">
+      <w:start w:val="1"/>
+      <w:numFmt w:val="bullet"/>
+      <w:lvlText w:val="o"/>
+      <w:lvlJc w:val="left"/>
+      <w:pPr>
+        <w:tabs>
+          <w:tab w:val="num" w:pos="1440"/>
+        </w:tabs>
+        <w:ind w:left="1440" w:hanging="360"/>
+      </w:pPr>
+      <w:rPr>
+        <w:rFonts w:ascii="Courier New" w:hAnsi="Courier New" w:hint="default"/>
+        <w:sz w:val="20"/>
+      </w:rPr>
+    </w:lvl>
+    <w:lvl w:ilvl="2" w:tentative="1">
+      <w:start w:val="1"/>
+      <w:numFmt w:val="decimal"/>
+      <w:lvlText w:val="%3."/>
+      <w:lvlJc w:val="left"/>
+      <w:pPr>
+        <w:tabs>
+          <w:tab w:val="num" w:pos="2160"/>
+        </w:tabs>
+        <w:ind w:left="2160" w:hanging="360"/>
+      </w:pPr>
+    </w:lvl>
+    <w:lvl w:ilvl="3" w:tentative="1">
+      <w:start w:val="1"/>
+      <w:numFmt w:val="decimal"/>
+      <w:lvlText w:val="%4."/>
+      <w:lvlJc w:val="left"/>
+      <w:pPr>
+        <w:tabs>
+          <w:tab w:val="num" w:pos="2880"/>
+        </w:tabs>
+        <w:ind w:left="2880" w:hanging="360"/>
+      </w:pPr>
+    </w:lvl>
+    <w:lvl w:ilvl="4" w:tentative="1">
+      <w:start w:val="1"/>
+      <w:numFmt w:val="decimal"/>
+      <w:lvlText w:val="%5."/>
+      <w:lvlJc w:val="left"/>
+      <w:pPr>
+        <w:tabs>
+          <w:tab w:val="num" w:pos="3600"/>
+        </w:tabs>
+        <w:ind w:left="3600" w:hanging="360"/>
+      </w:pPr>
+    </w:lvl>
+    <w:lvl w:ilvl="5" w:tentative="1">
+      <w:start w:val="1"/>
+      <w:numFmt w:val="decimal"/>
+      <w:lvlText w:val="%6."/>
+      <w:lvlJc w:val="left"/>
+      <w:pPr>
+        <w:tabs>
+          <w:tab w:val="num" w:pos="4320"/>
+        </w:tabs>
+        <w:ind w:left="4320" w:hanging="360"/>
+      </w:pPr>
+    </w:lvl>
+    <w:lvl w:ilvl="6" w:tentative="1">
+      <w:start w:val="1"/>
+      <w:numFmt w:val="decimal"/>
+      <w:lvlText w:val="%7."/>
+      <w:lvlJc w:val="left"/>
+      <w:pPr>
+        <w:tabs>
+          <w:tab w:val="num" w:pos="5040"/>
+        </w:tabs>
+        <w:ind w:left="5040" w:hanging="360"/>
+      </w:pPr>
+    </w:lvl>
+    <w:lvl w:ilvl="7" w:tentative="1">
+      <w:start w:val="1"/>
+      <w:numFmt w:val="decimal"/>
+      <w:lvlText w:val="%8."/>
+      <w:lvlJc w:val="left"/>
+      <w:pPr>
+        <w:tabs>
+          <w:tab w:val="num" w:pos="5760"/>
+        </w:tabs>
+        <w:ind w:left="5760" w:hanging="360"/>
+      </w:pPr>
+    </w:lvl>
+    <w:lvl w:ilvl="8" w:tentative="1">
+      <w:start w:val="1"/>
+      <w:numFmt w:val="decimal"/>
+      <w:lvlText w:val="%9."/>
+      <w:lvlJc w:val="left"/>
+      <w:pPr>
+        <w:tabs>
+          <w:tab w:val="num" w:pos="6480"/>
+        </w:tabs>
+        <w:ind w:left="6480" w:hanging="360"/>
+      </w:pPr>
+    </w:lvl>
+  </w:abstractNum>
+  <w:abstractNum w:abstractNumId="7" w15:restartNumberingAfterBreak="0">
     <w:nsid w:val="32AD595B"/>
     <w:multiLevelType w:val="multilevel"/>
     <w:tmpl w:val="A72CC0AE"/>
@@ -3702,7 +3816,7 @@
       </w:rPr>
     </w:lvl>
   </w:abstractNum>
-  <w:abstractNum w:abstractNumId="5" w15:restartNumberingAfterBreak="0">
+  <w:abstractNum w:abstractNumId="8" w15:restartNumberingAfterBreak="0">
     <w:nsid w:val="386B17F4"/>
     <w:multiLevelType w:val="multilevel"/>
     <w:tmpl w:val="3774BD5C"/>
@@ -3851,7 +3965,7 @@
       </w:rPr>
     </w:lvl>
   </w:abstractNum>
-  <w:abstractNum w:abstractNumId="6" w15:restartNumberingAfterBreak="0">
+  <w:abstractNum w:abstractNumId="9" w15:restartNumberingAfterBreak="0">
     <w:nsid w:val="3E685755"/>
     <w:multiLevelType w:val="multilevel"/>
     <w:tmpl w:val="3078EE3E"/>
@@ -3964,7 +4078,156 @@
       </w:pPr>
     </w:lvl>
   </w:abstractNum>
-  <w:abstractNum w:abstractNumId="7" w15:restartNumberingAfterBreak="0">
+  <w:abstractNum w:abstractNumId="10" w15:restartNumberingAfterBreak="0">
+    <w:nsid w:val="3ED072A9"/>
+    <w:multiLevelType w:val="multilevel"/>
+    <w:tmpl w:val="3EB0372C"/>
+    <w:lvl w:ilvl="0">
+      <w:start w:val="1"/>
+      <w:numFmt w:val="bullet"/>
+      <w:lvlText w:val=""/>
+      <w:lvlJc w:val="left"/>
+      <w:pPr>
+        <w:tabs>
+          <w:tab w:val="num" w:pos="720"/>
+        </w:tabs>
+        <w:ind w:left="720" w:hanging="360"/>
+      </w:pPr>
+      <w:rPr>
+        <w:rFonts w:ascii="Symbol" w:hAnsi="Symbol" w:hint="default"/>
+        <w:sz w:val="20"/>
+      </w:rPr>
+    </w:lvl>
+    <w:lvl w:ilvl="1" w:tentative="1">
+      <w:start w:val="1"/>
+      <w:numFmt w:val="bullet"/>
+      <w:lvlText w:val="o"/>
+      <w:lvlJc w:val="left"/>
+      <w:pPr>
+        <w:tabs>
+          <w:tab w:val="num" w:pos="1440"/>
+        </w:tabs>
+        <w:ind w:left="1440" w:hanging="360"/>
+      </w:pPr>
+      <w:rPr>
+        <w:rFonts w:ascii="Courier New" w:hAnsi="Courier New" w:hint="default"/>
+        <w:sz w:val="20"/>
+      </w:rPr>
+    </w:lvl>
+    <w:lvl w:ilvl="2" w:tentative="1">
+      <w:start w:val="1"/>
+      <w:numFmt w:val="bullet"/>
+      <w:lvlText w:val=""/>
+      <w:lvlJc w:val="left"/>
+      <w:pPr>
+        <w:tabs>
+          <w:tab w:val="num" w:pos="2160"/>
+        </w:tabs>
+        <w:ind w:left="2160" w:hanging="360"/>
+      </w:pPr>
+      <w:rPr>
+        <w:rFonts w:ascii="Wingdings" w:hAnsi="Wingdings" w:hint="default"/>
+        <w:sz w:val="20"/>
+      </w:rPr>
+    </w:lvl>
+    <w:lvl w:ilvl="3" w:tentative="1">
+      <w:start w:val="1"/>
+      <w:numFmt w:val="bullet"/>
+      <w:lvlText w:val=""/>
+      <w:lvlJc w:val="left"/>
+      <w:pPr>
+        <w:tabs>
+          <w:tab w:val="num" w:pos="2880"/>
+        </w:tabs>
+        <w:ind w:left="2880" w:hanging="360"/>
+      </w:pPr>
+      <w:rPr>
+        <w:rFonts w:ascii="Wingdings" w:hAnsi="Wingdings" w:hint="default"/>
+        <w:sz w:val="20"/>
+      </w:rPr>
+    </w:lvl>
+    <w:lvl w:ilvl="4" w:tentative="1">
+      <w:start w:val="1"/>
+      <w:numFmt w:val="bullet"/>
+      <w:lvlText w:val=""/>
+      <w:lvlJc w:val="left"/>
+      <w:pPr>
+        <w:tabs>
+          <w:tab w:val="num" w:pos="3600"/>
+        </w:tabs>
+        <w:ind w:left="3600" w:hanging="360"/>
+      </w:pPr>
+      <w:rPr>
+        <w:rFonts w:ascii="Wingdings" w:hAnsi="Wingdings" w:hint="default"/>
+        <w:sz w:val="20"/>
+      </w:rPr>
+    </w:lvl>
+    <w:lvl w:ilvl="5" w:tentative="1">
+      <w:start w:val="1"/>
+      <w:numFmt w:val="bullet"/>
+      <w:lvlText w:val=""/>
+      <w:lvlJc w:val="left"/>
+      <w:pPr>
+        <w:tabs>
+          <w:tab w:val="num" w:pos="4320"/>
+        </w:tabs>
+        <w:ind w:left="4320" w:hanging="360"/>
+      </w:pPr>
+      <w:rPr>
+        <w:rFonts w:ascii="Wingdings" w:hAnsi="Wingdings" w:hint="default"/>
+        <w:sz w:val="20"/>
+      </w:rPr>
+    </w:lvl>
+    <w:lvl w:ilvl="6" w:tentative="1">
+      <w:start w:val="1"/>
+      <w:numFmt w:val="bullet"/>
+      <w:lvlText w:val=""/>
+      <w:lvlJc w:val="left"/>
+      <w:pPr>
+        <w:tabs>
+          <w:tab w:val="num" w:pos="5040"/>
+        </w:tabs>
+        <w:ind w:left="5040" w:hanging="360"/>
+      </w:pPr>
+      <w:rPr>
+        <w:rFonts w:ascii="Wingdings" w:hAnsi="Wingdings" w:hint="default"/>
+        <w:sz w:val="20"/>
+      </w:rPr>
+    </w:lvl>
+    <w:lvl w:ilvl="7" w:tentative="1">
+      <w:start w:val="1"/>
+      <w:numFmt w:val="bullet"/>
+      <w:lvlText w:val=""/>
+      <w:lvlJc w:val="left"/>
+      <w:pPr>
+        <w:tabs>
+          <w:tab w:val="num" w:pos="5760"/>
+        </w:tabs>
+        <w:ind w:left="5760" w:hanging="360"/>
+      </w:pPr>
+      <w:rPr>
+        <w:rFonts w:ascii="Wingdings" w:hAnsi="Wingdings" w:hint="default"/>
+        <w:sz w:val="20"/>
+      </w:rPr>
+    </w:lvl>
+    <w:lvl w:ilvl="8" w:tentative="1">
+      <w:start w:val="1"/>
+      <w:numFmt w:val="bullet"/>
+      <w:lvlText w:val=""/>
+      <w:lvlJc w:val="left"/>
+      <w:pPr>
+        <w:tabs>
+          <w:tab w:val="num" w:pos="6480"/>
+        </w:tabs>
+        <w:ind w:left="6480" w:hanging="360"/>
+      </w:pPr>
+      <w:rPr>
+        <w:rFonts w:ascii="Wingdings" w:hAnsi="Wingdings" w:hint="default"/>
+        <w:sz w:val="20"/>
+      </w:rPr>
+    </w:lvl>
+  </w:abstractNum>
+  <w:abstractNum w:abstractNumId="11" w15:restartNumberingAfterBreak="0">
     <w:nsid w:val="44E82FC2"/>
     <w:multiLevelType w:val="multilevel"/>
     <w:tmpl w:val="D006172E"/>
@@ -4113,7 +4376,7 @@
       </w:rPr>
     </w:lvl>
   </w:abstractNum>
-  <w:abstractNum w:abstractNumId="8" w15:restartNumberingAfterBreak="0">
+  <w:abstractNum w:abstractNumId="12" w15:restartNumberingAfterBreak="0">
     <w:nsid w:val="45DC58E2"/>
     <w:multiLevelType w:val="multilevel"/>
     <w:tmpl w:val="3078EE3E"/>
@@ -4226,7 +4489,156 @@
       </w:pPr>
     </w:lvl>
   </w:abstractNum>
-  <w:abstractNum w:abstractNumId="9" w15:restartNumberingAfterBreak="0">
+  <w:abstractNum w:abstractNumId="13" w15:restartNumberingAfterBreak="0">
+    <w:nsid w:val="4920226B"/>
+    <w:multiLevelType w:val="multilevel"/>
+    <w:tmpl w:val="4A72705A"/>
+    <w:lvl w:ilvl="0">
+      <w:start w:val="1"/>
+      <w:numFmt w:val="bullet"/>
+      <w:lvlText w:val=""/>
+      <w:lvlJc w:val="left"/>
+      <w:pPr>
+        <w:tabs>
+          <w:tab w:val="num" w:pos="720"/>
+        </w:tabs>
+        <w:ind w:left="720" w:hanging="360"/>
+      </w:pPr>
+      <w:rPr>
+        <w:rFonts w:ascii="Symbol" w:hAnsi="Symbol" w:hint="default"/>
+        <w:sz w:val="20"/>
+      </w:rPr>
+    </w:lvl>
+    <w:lvl w:ilvl="1" w:tentative="1">
+      <w:start w:val="1"/>
+      <w:numFmt w:val="bullet"/>
+      <w:lvlText w:val="o"/>
+      <w:lvlJc w:val="left"/>
+      <w:pPr>
+        <w:tabs>
+          <w:tab w:val="num" w:pos="1440"/>
+        </w:tabs>
+        <w:ind w:left="1440" w:hanging="360"/>
+      </w:pPr>
+      <w:rPr>
+        <w:rFonts w:ascii="Courier New" w:hAnsi="Courier New" w:hint="default"/>
+        <w:sz w:val="20"/>
+      </w:rPr>
+    </w:lvl>
+    <w:lvl w:ilvl="2" w:tentative="1">
+      <w:start w:val="1"/>
+      <w:numFmt w:val="bullet"/>
+      <w:lvlText w:val=""/>
+      <w:lvlJc w:val="left"/>
+      <w:pPr>
+        <w:tabs>
+          <w:tab w:val="num" w:pos="2160"/>
+        </w:tabs>
+        <w:ind w:left="2160" w:hanging="360"/>
+      </w:pPr>
+      <w:rPr>
+        <w:rFonts w:ascii="Wingdings" w:hAnsi="Wingdings" w:hint="default"/>
+        <w:sz w:val="20"/>
+      </w:rPr>
+    </w:lvl>
+    <w:lvl w:ilvl="3" w:tentative="1">
+      <w:start w:val="1"/>
+      <w:numFmt w:val="bullet"/>
+      <w:lvlText w:val=""/>
+      <w:lvlJc w:val="left"/>
+      <w:pPr>
+        <w:tabs>
+          <w:tab w:val="num" w:pos="2880"/>
+        </w:tabs>
+        <w:ind w:left="2880" w:hanging="360"/>
+      </w:pPr>
+      <w:rPr>
+        <w:rFonts w:ascii="Wingdings" w:hAnsi="Wingdings" w:hint="default"/>
+        <w:sz w:val="20"/>
+      </w:rPr>
+    </w:lvl>
+    <w:lvl w:ilvl="4" w:tentative="1">
+      <w:start w:val="1"/>
+      <w:numFmt w:val="bullet"/>
+      <w:lvlText w:val=""/>
+      <w:lvlJc w:val="left"/>
+      <w:pPr>
+        <w:tabs>
+          <w:tab w:val="num" w:pos="3600"/>
+        </w:tabs>
+        <w:ind w:left="3600" w:hanging="360"/>
+      </w:pPr>
+      <w:rPr>
+        <w:rFonts w:ascii="Wingdings" w:hAnsi="Wingdings" w:hint="default"/>
+        <w:sz w:val="20"/>
+      </w:rPr>
+    </w:lvl>
+    <w:lvl w:ilvl="5" w:tentative="1">
+      <w:start w:val="1"/>
+      <w:numFmt w:val="bullet"/>
+      <w:lvlText w:val=""/>
+      <w:lvlJc w:val="left"/>
+      <w:pPr>
+        <w:tabs>
+          <w:tab w:val="num" w:pos="4320"/>
+        </w:tabs>
+        <w:ind w:left="4320" w:hanging="360"/>
+      </w:pPr>
+      <w:rPr>
+        <w:rFonts w:ascii="Wingdings" w:hAnsi="Wingdings" w:hint="default"/>
+        <w:sz w:val="20"/>
+      </w:rPr>
+    </w:lvl>
+    <w:lvl w:ilvl="6" w:tentative="1">
+      <w:start w:val="1"/>
+      <w:numFmt w:val="bullet"/>
+      <w:lvlText w:val=""/>
+      <w:lvlJc w:val="left"/>
+      <w:pPr>
+        <w:tabs>
+          <w:tab w:val="num" w:pos="5040"/>
+        </w:tabs>
+        <w:ind w:left="5040" w:hanging="360"/>
+      </w:pPr>
+      <w:rPr>
+        <w:rFonts w:ascii="Wingdings" w:hAnsi="Wingdings" w:hint="default"/>
+        <w:sz w:val="20"/>
+      </w:rPr>
+    </w:lvl>
+    <w:lvl w:ilvl="7" w:tentative="1">
+      <w:start w:val="1"/>
+      <w:numFmt w:val="bullet"/>
+      <w:lvlText w:val=""/>
+      <w:lvlJc w:val="left"/>
+      <w:pPr>
+        <w:tabs>
+          <w:tab w:val="num" w:pos="5760"/>
+        </w:tabs>
+        <w:ind w:left="5760" w:hanging="360"/>
+      </w:pPr>
+      <w:rPr>
+        <w:rFonts w:ascii="Wingdings" w:hAnsi="Wingdings" w:hint="default"/>
+        <w:sz w:val="20"/>
+      </w:rPr>
+    </w:lvl>
+    <w:lvl w:ilvl="8" w:tentative="1">
+      <w:start w:val="1"/>
+      <w:numFmt w:val="bullet"/>
+      <w:lvlText w:val=""/>
+      <w:lvlJc w:val="left"/>
+      <w:pPr>
+        <w:tabs>
+          <w:tab w:val="num" w:pos="6480"/>
+        </w:tabs>
+        <w:ind w:left="6480" w:hanging="360"/>
+      </w:pPr>
+      <w:rPr>
+        <w:rFonts w:ascii="Wingdings" w:hAnsi="Wingdings" w:hint="default"/>
+        <w:sz w:val="20"/>
+      </w:rPr>
+    </w:lvl>
+  </w:abstractNum>
+  <w:abstractNum w:abstractNumId="14" w15:restartNumberingAfterBreak="0">
     <w:nsid w:val="4BFF3CDF"/>
     <w:multiLevelType w:val="multilevel"/>
     <w:tmpl w:val="125EEB54"/>
@@ -4339,7 +4751,7 @@
       </w:pPr>
     </w:lvl>
   </w:abstractNum>
-  <w:abstractNum w:abstractNumId="10" w15:restartNumberingAfterBreak="0">
+  <w:abstractNum w:abstractNumId="15" w15:restartNumberingAfterBreak="0">
     <w:nsid w:val="516A1878"/>
     <w:multiLevelType w:val="multilevel"/>
     <w:tmpl w:val="D166BE0E"/>
@@ -4488,7 +4900,7 @@
       </w:rPr>
     </w:lvl>
   </w:abstractNum>
-  <w:abstractNum w:abstractNumId="11" w15:restartNumberingAfterBreak="0">
+  <w:abstractNum w:abstractNumId="16" w15:restartNumberingAfterBreak="0">
     <w:nsid w:val="57E24D0B"/>
     <w:multiLevelType w:val="multilevel"/>
     <w:tmpl w:val="E11219E8"/>
@@ -4637,7 +5049,7 @@
       </w:rPr>
     </w:lvl>
   </w:abstractNum>
-  <w:abstractNum w:abstractNumId="12" w15:restartNumberingAfterBreak="0">
+  <w:abstractNum w:abstractNumId="17" w15:restartNumberingAfterBreak="0">
     <w:nsid w:val="58E875D3"/>
     <w:multiLevelType w:val="multilevel"/>
     <w:tmpl w:val="C01EE34A"/>
@@ -4786,7 +5198,7 @@
       </w:rPr>
     </w:lvl>
   </w:abstractNum>
-  <w:abstractNum w:abstractNumId="13" w15:restartNumberingAfterBreak="0">
+  <w:abstractNum w:abstractNumId="18" w15:restartNumberingAfterBreak="0">
     <w:nsid w:val="631E531D"/>
     <w:multiLevelType w:val="multilevel"/>
     <w:tmpl w:val="745C5F92"/>
@@ -4935,7 +5347,7 @@
       </w:rPr>
     </w:lvl>
   </w:abstractNum>
-  <w:abstractNum w:abstractNumId="14" w15:restartNumberingAfterBreak="0">
+  <w:abstractNum w:abstractNumId="19" w15:restartNumberingAfterBreak="0">
     <w:nsid w:val="658C704C"/>
     <w:multiLevelType w:val="multilevel"/>
     <w:tmpl w:val="A82E9688"/>
@@ -5084,7 +5496,7 @@
       </w:rPr>
     </w:lvl>
   </w:abstractNum>
-  <w:abstractNum w:abstractNumId="15" w15:restartNumberingAfterBreak="0">
+  <w:abstractNum w:abstractNumId="20" w15:restartNumberingAfterBreak="0">
     <w:nsid w:val="688D4625"/>
     <w:multiLevelType w:val="multilevel"/>
     <w:tmpl w:val="6ED8B73C"/>
@@ -5233,53 +5645,372 @@
       </w:rPr>
     </w:lvl>
   </w:abstractNum>
+  <w:abstractNum w:abstractNumId="21" w15:restartNumberingAfterBreak="0">
+    <w:nsid w:val="70B779ED"/>
+    <w:multiLevelType w:val="multilevel"/>
+    <w:tmpl w:val="7D583546"/>
+    <w:lvl w:ilvl="0">
+      <w:start w:val="1"/>
+      <w:numFmt w:val="bullet"/>
+      <w:lvlText w:val=""/>
+      <w:lvlJc w:val="left"/>
+      <w:pPr>
+        <w:tabs>
+          <w:tab w:val="num" w:pos="720"/>
+        </w:tabs>
+        <w:ind w:left="720" w:hanging="360"/>
+      </w:pPr>
+      <w:rPr>
+        <w:rFonts w:ascii="Symbol" w:hAnsi="Symbol" w:hint="default"/>
+        <w:sz w:val="20"/>
+      </w:rPr>
+    </w:lvl>
+    <w:lvl w:ilvl="1" w:tentative="1">
+      <w:start w:val="1"/>
+      <w:numFmt w:val="bullet"/>
+      <w:lvlText w:val="o"/>
+      <w:lvlJc w:val="left"/>
+      <w:pPr>
+        <w:tabs>
+          <w:tab w:val="num" w:pos="1440"/>
+        </w:tabs>
+        <w:ind w:left="1440" w:hanging="360"/>
+      </w:pPr>
+      <w:rPr>
+        <w:rFonts w:ascii="Courier New" w:hAnsi="Courier New" w:hint="default"/>
+        <w:sz w:val="20"/>
+      </w:rPr>
+    </w:lvl>
+    <w:lvl w:ilvl="2" w:tentative="1">
+      <w:start w:val="1"/>
+      <w:numFmt w:val="bullet"/>
+      <w:lvlText w:val=""/>
+      <w:lvlJc w:val="left"/>
+      <w:pPr>
+        <w:tabs>
+          <w:tab w:val="num" w:pos="2160"/>
+        </w:tabs>
+        <w:ind w:left="2160" w:hanging="360"/>
+      </w:pPr>
+      <w:rPr>
+        <w:rFonts w:ascii="Wingdings" w:hAnsi="Wingdings" w:hint="default"/>
+        <w:sz w:val="20"/>
+      </w:rPr>
+    </w:lvl>
+    <w:lvl w:ilvl="3" w:tentative="1">
+      <w:start w:val="1"/>
+      <w:numFmt w:val="bullet"/>
+      <w:lvlText w:val=""/>
+      <w:lvlJc w:val="left"/>
+      <w:pPr>
+        <w:tabs>
+          <w:tab w:val="num" w:pos="2880"/>
+        </w:tabs>
+        <w:ind w:left="2880" w:hanging="360"/>
+      </w:pPr>
+      <w:rPr>
+        <w:rFonts w:ascii="Wingdings" w:hAnsi="Wingdings" w:hint="default"/>
+        <w:sz w:val="20"/>
+      </w:rPr>
+    </w:lvl>
+    <w:lvl w:ilvl="4" w:tentative="1">
+      <w:start w:val="1"/>
+      <w:numFmt w:val="bullet"/>
+      <w:lvlText w:val=""/>
+      <w:lvlJc w:val="left"/>
+      <w:pPr>
+        <w:tabs>
+          <w:tab w:val="num" w:pos="3600"/>
+        </w:tabs>
+        <w:ind w:left="3600" w:hanging="360"/>
+      </w:pPr>
+      <w:rPr>
+        <w:rFonts w:ascii="Wingdings" w:hAnsi="Wingdings" w:hint="default"/>
+        <w:sz w:val="20"/>
+      </w:rPr>
+    </w:lvl>
+    <w:lvl w:ilvl="5" w:tentative="1">
+      <w:start w:val="1"/>
+      <w:numFmt w:val="bullet"/>
+      <w:lvlText w:val=""/>
+      <w:lvlJc w:val="left"/>
+      <w:pPr>
+        <w:tabs>
+          <w:tab w:val="num" w:pos="4320"/>
+        </w:tabs>
+        <w:ind w:left="4320" w:hanging="360"/>
+      </w:pPr>
+      <w:rPr>
+        <w:rFonts w:ascii="Wingdings" w:hAnsi="Wingdings" w:hint="default"/>
+        <w:sz w:val="20"/>
+      </w:rPr>
+    </w:lvl>
+    <w:lvl w:ilvl="6" w:tentative="1">
+      <w:start w:val="1"/>
+      <w:numFmt w:val="bullet"/>
+      <w:lvlText w:val=""/>
+      <w:lvlJc w:val="left"/>
+      <w:pPr>
+        <w:tabs>
+          <w:tab w:val="num" w:pos="5040"/>
+        </w:tabs>
+        <w:ind w:left="5040" w:hanging="360"/>
+      </w:pPr>
+      <w:rPr>
+        <w:rFonts w:ascii="Wingdings" w:hAnsi="Wingdings" w:hint="default"/>
+        <w:sz w:val="20"/>
+      </w:rPr>
+    </w:lvl>
+    <w:lvl w:ilvl="7" w:tentative="1">
+      <w:start w:val="1"/>
+      <w:numFmt w:val="bullet"/>
+      <w:lvlText w:val=""/>
+      <w:lvlJc w:val="left"/>
+      <w:pPr>
+        <w:tabs>
+          <w:tab w:val="num" w:pos="5760"/>
+        </w:tabs>
+        <w:ind w:left="5760" w:hanging="360"/>
+      </w:pPr>
+      <w:rPr>
+        <w:rFonts w:ascii="Wingdings" w:hAnsi="Wingdings" w:hint="default"/>
+        <w:sz w:val="20"/>
+      </w:rPr>
+    </w:lvl>
+    <w:lvl w:ilvl="8" w:tentative="1">
+      <w:start w:val="1"/>
+      <w:numFmt w:val="bullet"/>
+      <w:lvlText w:val=""/>
+      <w:lvlJc w:val="left"/>
+      <w:pPr>
+        <w:tabs>
+          <w:tab w:val="num" w:pos="6480"/>
+        </w:tabs>
+        <w:ind w:left="6480" w:hanging="360"/>
+      </w:pPr>
+      <w:rPr>
+        <w:rFonts w:ascii="Wingdings" w:hAnsi="Wingdings" w:hint="default"/>
+        <w:sz w:val="20"/>
+      </w:rPr>
+    </w:lvl>
+  </w:abstractNum>
+  <w:abstractNum w:abstractNumId="22" w15:restartNumberingAfterBreak="0">
+    <w:nsid w:val="7EDB5C8E"/>
+    <w:multiLevelType w:val="multilevel"/>
+    <w:tmpl w:val="F1DC359A"/>
+    <w:lvl w:ilvl="0">
+      <w:start w:val="1"/>
+      <w:numFmt w:val="bullet"/>
+      <w:lvlText w:val=""/>
+      <w:lvlJc w:val="left"/>
+      <w:pPr>
+        <w:tabs>
+          <w:tab w:val="num" w:pos="720"/>
+        </w:tabs>
+        <w:ind w:left="720" w:hanging="360"/>
+      </w:pPr>
+      <w:rPr>
+        <w:rFonts w:ascii="Symbol" w:hAnsi="Symbol" w:hint="default"/>
+        <w:sz w:val="20"/>
+      </w:rPr>
+    </w:lvl>
+    <w:lvl w:ilvl="1" w:tentative="1">
+      <w:start w:val="1"/>
+      <w:numFmt w:val="bullet"/>
+      <w:lvlText w:val="o"/>
+      <w:lvlJc w:val="left"/>
+      <w:pPr>
+        <w:tabs>
+          <w:tab w:val="num" w:pos="1440"/>
+        </w:tabs>
+        <w:ind w:left="1440" w:hanging="360"/>
+      </w:pPr>
+      <w:rPr>
+        <w:rFonts w:ascii="Courier New" w:hAnsi="Courier New" w:hint="default"/>
+        <w:sz w:val="20"/>
+      </w:rPr>
+    </w:lvl>
+    <w:lvl w:ilvl="2" w:tentative="1">
+      <w:start w:val="1"/>
+      <w:numFmt w:val="bullet"/>
+      <w:lvlText w:val=""/>
+      <w:lvlJc w:val="left"/>
+      <w:pPr>
+        <w:tabs>
+          <w:tab w:val="num" w:pos="2160"/>
+        </w:tabs>
+        <w:ind w:left="2160" w:hanging="360"/>
+      </w:pPr>
+      <w:rPr>
+        <w:rFonts w:ascii="Wingdings" w:hAnsi="Wingdings" w:hint="default"/>
+        <w:sz w:val="20"/>
+      </w:rPr>
+    </w:lvl>
+    <w:lvl w:ilvl="3" w:tentative="1">
+      <w:start w:val="1"/>
+      <w:numFmt w:val="bullet"/>
+      <w:lvlText w:val=""/>
+      <w:lvlJc w:val="left"/>
+      <w:pPr>
+        <w:tabs>
+          <w:tab w:val="num" w:pos="2880"/>
+        </w:tabs>
+        <w:ind w:left="2880" w:hanging="360"/>
+      </w:pPr>
+      <w:rPr>
+        <w:rFonts w:ascii="Wingdings" w:hAnsi="Wingdings" w:hint="default"/>
+        <w:sz w:val="20"/>
+      </w:rPr>
+    </w:lvl>
+    <w:lvl w:ilvl="4" w:tentative="1">
+      <w:start w:val="1"/>
+      <w:numFmt w:val="bullet"/>
+      <w:lvlText w:val=""/>
+      <w:lvlJc w:val="left"/>
+      <w:pPr>
+        <w:tabs>
+          <w:tab w:val="num" w:pos="3600"/>
+        </w:tabs>
+        <w:ind w:left="3600" w:hanging="360"/>
+      </w:pPr>
+      <w:rPr>
+        <w:rFonts w:ascii="Wingdings" w:hAnsi="Wingdings" w:hint="default"/>
+        <w:sz w:val="20"/>
+      </w:rPr>
+    </w:lvl>
+    <w:lvl w:ilvl="5" w:tentative="1">
+      <w:start w:val="1"/>
+      <w:numFmt w:val="bullet"/>
+      <w:lvlText w:val=""/>
+      <w:lvlJc w:val="left"/>
+      <w:pPr>
+        <w:tabs>
+          <w:tab w:val="num" w:pos="4320"/>
+        </w:tabs>
+        <w:ind w:left="4320" w:hanging="360"/>
+      </w:pPr>
+      <w:rPr>
+        <w:rFonts w:ascii="Wingdings" w:hAnsi="Wingdings" w:hint="default"/>
+        <w:sz w:val="20"/>
+      </w:rPr>
+    </w:lvl>
+    <w:lvl w:ilvl="6" w:tentative="1">
+      <w:start w:val="1"/>
+      <w:numFmt w:val="bullet"/>
+      <w:lvlText w:val=""/>
+      <w:lvlJc w:val="left"/>
+      <w:pPr>
+        <w:tabs>
+          <w:tab w:val="num" w:pos="5040"/>
+        </w:tabs>
+        <w:ind w:left="5040" w:hanging="360"/>
+      </w:pPr>
+      <w:rPr>
+        <w:rFonts w:ascii="Wingdings" w:hAnsi="Wingdings" w:hint="default"/>
+        <w:sz w:val="20"/>
+      </w:rPr>
+    </w:lvl>
+    <w:lvl w:ilvl="7" w:tentative="1">
+      <w:start w:val="1"/>
+      <w:numFmt w:val="bullet"/>
+      <w:lvlText w:val=""/>
+      <w:lvlJc w:val="left"/>
+      <w:pPr>
+        <w:tabs>
+          <w:tab w:val="num" w:pos="5760"/>
+        </w:tabs>
+        <w:ind w:left="5760" w:hanging="360"/>
+      </w:pPr>
+      <w:rPr>
+        <w:rFonts w:ascii="Wingdings" w:hAnsi="Wingdings" w:hint="default"/>
+        <w:sz w:val="20"/>
+      </w:rPr>
+    </w:lvl>
+    <w:lvl w:ilvl="8" w:tentative="1">
+      <w:start w:val="1"/>
+      <w:numFmt w:val="bullet"/>
+      <w:lvlText w:val=""/>
+      <w:lvlJc w:val="left"/>
+      <w:pPr>
+        <w:tabs>
+          <w:tab w:val="num" w:pos="6480"/>
+        </w:tabs>
+        <w:ind w:left="6480" w:hanging="360"/>
+      </w:pPr>
+      <w:rPr>
+        <w:rFonts w:ascii="Wingdings" w:hAnsi="Wingdings" w:hint="default"/>
+        <w:sz w:val="20"/>
+      </w:rPr>
+    </w:lvl>
+  </w:abstractNum>
   <w:num w:numId="1" w16cid:durableId="1004240484">
+    <w:abstractNumId w:val="12"/>
+  </w:num>
+  <w:num w:numId="2" w16cid:durableId="1407603916">
+    <w:abstractNumId w:val="14"/>
+  </w:num>
+  <w:num w:numId="3" w16cid:durableId="209653983">
+    <w:abstractNumId w:val="20"/>
+  </w:num>
+  <w:num w:numId="4" w16cid:durableId="305475630">
+    <w:abstractNumId w:val="9"/>
+  </w:num>
+  <w:num w:numId="5" w16cid:durableId="427434156">
+    <w:abstractNumId w:val="16"/>
+  </w:num>
+  <w:num w:numId="6" w16cid:durableId="1806385444">
+    <w:abstractNumId w:val="2"/>
+  </w:num>
+  <w:num w:numId="7" w16cid:durableId="2012488143">
     <w:abstractNumId w:val="8"/>
   </w:num>
-  <w:num w:numId="2" w16cid:durableId="1407603916">
-    <w:abstractNumId w:val="9"/>
+  <w:num w:numId="8" w16cid:durableId="1372728563">
+    <w:abstractNumId w:val="11"/>
   </w:num>
-  <w:num w:numId="3" w16cid:durableId="209653983">
+  <w:num w:numId="9" w16cid:durableId="79571265">
+    <w:abstractNumId w:val="4"/>
+  </w:num>
+  <w:num w:numId="10" w16cid:durableId="1601907873">
+    <w:abstractNumId w:val="5"/>
+  </w:num>
+  <w:num w:numId="11" w16cid:durableId="1523351346">
     <w:abstractNumId w:val="15"/>
   </w:num>
-  <w:num w:numId="4" w16cid:durableId="305475630">
-    <w:abstractNumId w:val="6"/>
+  <w:num w:numId="12" w16cid:durableId="1638561208">
+    <w:abstractNumId w:val="18"/>
   </w:num>
-  <w:num w:numId="5" w16cid:durableId="427434156">
-    <w:abstractNumId w:val="11"/>
+  <w:num w:numId="13" w16cid:durableId="597492078">
+    <w:abstractNumId w:val="19"/>
   </w:num>
-  <w:num w:numId="6" w16cid:durableId="1806385444">
+  <w:num w:numId="14" w16cid:durableId="261650724">
+    <w:abstractNumId w:val="17"/>
+  </w:num>
+  <w:num w:numId="15" w16cid:durableId="624233415">
+    <w:abstractNumId w:val="7"/>
+  </w:num>
+  <w:num w:numId="16" w16cid:durableId="2124298626">
     <w:abstractNumId w:val="1"/>
   </w:num>
-  <w:num w:numId="7" w16cid:durableId="2012488143">
-    <w:abstractNumId w:val="5"/>
-  </w:num>
-  <w:num w:numId="8" w16cid:durableId="1372728563">
-    <w:abstractNumId w:val="7"/>
-  </w:num>
-  <w:num w:numId="9" w16cid:durableId="79571265">
-    <w:abstractNumId w:val="2"/>
-  </w:num>
-  <w:num w:numId="10" w16cid:durableId="1601907873">
+  <w:num w:numId="17" w16cid:durableId="452138161">
     <w:abstractNumId w:val="3"/>
   </w:num>
-  <w:num w:numId="11" w16cid:durableId="1523351346">
+  <w:num w:numId="18" w16cid:durableId="1839881393">
+    <w:abstractNumId w:val="0"/>
+  </w:num>
+  <w:num w:numId="19" w16cid:durableId="1968506866">
     <w:abstractNumId w:val="10"/>
   </w:num>
-  <w:num w:numId="12" w16cid:durableId="1638561208">
+  <w:num w:numId="20" w16cid:durableId="1812552708">
+    <w:abstractNumId w:val="22"/>
+  </w:num>
+  <w:num w:numId="21" w16cid:durableId="1549730665">
     <w:abstractNumId w:val="13"/>
   </w:num>
-  <w:num w:numId="13" w16cid:durableId="597492078">
-    <w:abstractNumId w:val="14"/>
+  <w:num w:numId="22" w16cid:durableId="308562409">
+    <w:abstractNumId w:val="21"/>
   </w:num>
-  <w:num w:numId="14" w16cid:durableId="261650724">
-    <w:abstractNumId w:val="12"/>
-  </w:num>
-  <w:num w:numId="15" w16cid:durableId="624233415">
-    <w:abstractNumId w:val="4"/>
-  </w:num>
-  <w:num w:numId="16" w16cid:durableId="2124298626">
-    <w:abstractNumId w:val="0"/>
+  <w:num w:numId="23" w16cid:durableId="1639263232">
+    <w:abstractNumId w:val="6"/>
   </w:num>
 </w:numbering>
 </file>

</xml_diff>